<commit_message>
Add thesis Chapter 1 and reusable chapter Markdown files
</commit_message>
<xml_diff>
--- a/FYP Thesis Template.docx
+++ b/FYP Thesis Template.docx
@@ -63,7 +63,7 @@
           <w:sz w:val="36"/>
           <w:szCs w:val="36"/>
         </w:rPr>
-        <w:t>AN EXPLORATION OF THE EFFECTS OF MOODS IN ATTITUDE JUDGEMENTS</w:t>
+        <w:t>A HYBRID RAG-FSM ARCHITECTURE FOR INTERNET-DELIVERED COGNITIVE BEHAVIORAL THERAPY FOR INSOMNIA</w:t>
       </w:r>
     </w:p>
     <w:p>
@@ -182,7 +182,7 @@
           <w:sz w:val="36"/>
           <w:szCs w:val="36"/>
         </w:rPr>
-        <w:t>YVONNE CAROLINE</w:t>
+        <w:t>LI RUIBING</w:t>
       </w:r>
     </w:p>
     <w:p>
@@ -610,7 +610,7 @@
           <w:szCs w:val="32"/>
           <w:highlight w:val="yellow"/>
         </w:rPr>
-        <w:t>AN EXPLORATION OF THE EFFECTS OF MOODS IN ATTITUDE JUDGEMENTS</w:t>
+        <w:t>A HYBRID RAG-FSM ARCHITECTURE FOR INTERNET-DELIVERED COGNITIVE BEHAVIORAL THERAPY FOR INSOMNIA</w:t>
       </w:r>
       <w:r>
         <w:rPr>
@@ -620,7 +620,6 @@
           <w:sz w:val="32"/>
           <w:szCs w:val="32"/>
         </w:rPr>
-        <w:t xml:space="preserve"> </w:t>
       </w:r>
     </w:p>
     <w:p>
@@ -768,19 +767,18 @@
           </w:tcPr>
           <w:p>
             <w:pPr>
-              <w:spacing w:line="276" w:lineRule="auto"/>
+              <w:widowControl/>
+              <w:spacing w:line="360" w:lineRule="auto" w:before="0" w:after="0"/>
+              <w:ind w:left="0" w:right="0" w:firstLine="0"/>
               <w:jc w:val="left"/>
-              <w:rPr>
-                <w:rFonts w:ascii="Times New Roman" w:hAnsi="Times New Roman"/>
-                <w:sz w:val="24"/>
-              </w:rPr>
             </w:pPr>
             <w:r>
               <w:rPr>
                 <w:rFonts w:ascii="Times New Roman" w:hAnsi="Times New Roman"/>
+                <w:b w:val="0"/>
                 <w:sz w:val="24"/>
               </w:rPr>
-              <w:t>YVONNE CAROLINE</w:t>
+              <w:t>LI RUIBING</w:t>
             </w:r>
           </w:p>
         </w:tc>
@@ -834,19 +832,18 @@
           </w:tcPr>
           <w:p>
             <w:pPr>
-              <w:spacing w:line="276" w:lineRule="auto"/>
+              <w:widowControl/>
+              <w:spacing w:line="360" w:lineRule="auto" w:before="0" w:after="0"/>
+              <w:ind w:left="0" w:right="0" w:firstLine="0"/>
               <w:jc w:val="left"/>
-              <w:rPr>
-                <w:rFonts w:ascii="Times New Roman" w:hAnsi="Times New Roman"/>
-                <w:sz w:val="24"/>
-              </w:rPr>
             </w:pPr>
             <w:r>
               <w:rPr>
                 <w:rFonts w:ascii="Times New Roman" w:hAnsi="Times New Roman"/>
+                <w:b w:val="0"/>
                 <w:sz w:val="24"/>
               </w:rPr>
-              <w:t>XXX1609XXX</w:t>
+              <w:t>SWE2309520</w:t>
             </w:r>
           </w:p>
         </w:tc>
@@ -968,17 +965,18 @@
           </w:tcPr>
           <w:p>
             <w:pPr>
-              <w:pStyle w:val="Default"/>
-              <w:spacing w:line="276" w:lineRule="auto"/>
-              <w:rPr>
-                <w:highlight w:val="yellow"/>
-              </w:rPr>
+              <w:widowControl/>
+              <w:spacing w:line="360" w:lineRule="auto" w:before="0" w:after="0"/>
+              <w:ind w:left="0" w:right="0" w:firstLine="0"/>
+              <w:jc w:val="left"/>
             </w:pPr>
             <w:r>
               <w:rPr>
-                <w:highlight w:val="yellow"/>
+                <w:rFonts w:ascii="Times New Roman" w:hAnsi="Times New Roman"/>
+                <w:b w:val="0"/>
+                <w:sz w:val="24"/>
               </w:rPr>
-              <w:t>BACHELOR OF ENGINEERING IN DIGITAL MEDIA TECHNOLOGY (HONOURS)</w:t>
+              <w:t>BACHELOR OF ENGINEERING IN SOFTWARE ENGINEERING (HONOURS)</w:t>
             </w:r>
           </w:p>
         </w:tc>
@@ -1032,19 +1030,18 @@
           </w:tcPr>
           <w:p>
             <w:pPr>
-              <w:spacing w:line="276" w:lineRule="auto"/>
+              <w:widowControl/>
+              <w:spacing w:line="360" w:lineRule="auto" w:before="0" w:after="0"/>
+              <w:ind w:left="0" w:right="0" w:firstLine="0"/>
               <w:jc w:val="left"/>
-              <w:rPr>
-                <w:rFonts w:ascii="Times New Roman" w:hAnsi="Times New Roman"/>
-                <w:sz w:val="24"/>
-              </w:rPr>
             </w:pPr>
             <w:r>
               <w:rPr>
                 <w:rFonts w:ascii="Times New Roman" w:hAnsi="Times New Roman"/>
+                <w:b w:val="0"/>
                 <w:sz w:val="24"/>
               </w:rPr>
-              <w:t>20XX/0X</w:t>
+              <w:t>[Confirm intake]</w:t>
             </w:r>
           </w:p>
         </w:tc>
@@ -1143,36 +1140,18 @@
           </w:tcPr>
           <w:p>
             <w:pPr>
-              <w:spacing w:line="276" w:lineRule="auto"/>
+              <w:widowControl/>
+              <w:spacing w:line="360" w:lineRule="auto" w:before="0" w:after="0"/>
+              <w:ind w:left="0" w:right="0" w:firstLine="0"/>
               <w:jc w:val="left"/>
-              <w:rPr>
-                <w:rFonts w:ascii="Times New Roman" w:hAnsi="Times New Roman"/>
-                <w:sz w:val="24"/>
-              </w:rPr>
             </w:pPr>
             <w:r>
               <w:rPr>
                 <w:rFonts w:ascii="Times New Roman" w:hAnsi="Times New Roman"/>
+                <w:b w:val="0"/>
                 <w:sz w:val="24"/>
               </w:rPr>
-              <w:t>NAME</w:t>
-            </w:r>
-          </w:p>
-          <w:p>
-            <w:pPr>
-              <w:spacing w:line="276" w:lineRule="auto"/>
-              <w:jc w:val="left"/>
-              <w:rPr>
-                <w:rFonts w:ascii="Times New Roman" w:hAnsi="Times New Roman"/>
-                <w:sz w:val="24"/>
-              </w:rPr>
-            </w:pPr>
-            <w:r>
-              <w:rPr>
-                <w:rFonts w:ascii="Times New Roman" w:hAnsi="Times New Roman"/>
-                <w:sz w:val="24"/>
-              </w:rPr>
-              <w:t>TITLE</w:t>
+              <w:t>Chandra Reka Ramachandiran</w:t>
             </w:r>
           </w:p>
         </w:tc>
@@ -1217,7 +1196,9 @@
     </w:p>
     <w:p>
       <w:pPr>
-        <w:spacing w:line="276" w:lineRule="auto"/>
+        <w:widowControl/>
+        <w:spacing w:line="360" w:lineRule="auto" w:before="0" w:after="240"/>
+        <w:ind w:left="0" w:right="0" w:firstLine="0"/>
         <w:jc w:val="center"/>
         <w:rPr>
           <w:rFonts w:ascii="Times New Roman" w:eastAsiaTheme="minorEastAsia" w:hAnsi="Times New Roman"/>
@@ -1228,13 +1209,11 @@
       </w:pPr>
       <w:r>
         <w:rPr>
-          <w:rFonts w:ascii="Times New Roman" w:eastAsiaTheme="minorEastAsia" w:hAnsi="Times New Roman"/>
-          <w:sz w:val="28"/>
-          <w:szCs w:val="28"/>
-          <w:highlight w:val="yellow"/>
-          <w:lang w:eastAsia="zh-CN"/>
-        </w:rPr>
-        <w:t>JULY 2026</w:t>
+          <w:rFonts w:ascii="Times New Roman" w:hAnsi="Times New Roman"/>
+          <w:b w:val="0"/>
+          <w:sz w:val="24"/>
+        </w:rPr>
+        <w:t>DECEMBER 2026</w:t>
       </w:r>
     </w:p>
     <w:p>
@@ -1334,64 +1313,26 @@
         </w:rPr>
       </w:pPr>
       <w:r>
+        <w:t>Name</w:t>
+        <w:tab/>
+        <w:tab/>
+        <w:t>: Li Ruibing</w:t>
+      </w:r>
+    </w:p>
+    <w:p>
+      <w:pPr>
+        <w:spacing w:line="360" w:lineRule="auto"/>
         <w:rPr>
           <w:rFonts w:ascii="Times New Roman" w:hAnsi="Times New Roman"/>
           <w:color w:val="000000" w:themeColor="text1"/>
           <w:sz w:val="24"/>
         </w:rPr>
-        <w:t xml:space="preserve">Name </w:t>
-      </w:r>
-      <w:r>
-        <w:rPr>
-          <w:rFonts w:ascii="Times New Roman" w:hAnsi="Times New Roman"/>
-          <w:color w:val="000000" w:themeColor="text1"/>
-          <w:sz w:val="24"/>
-        </w:rPr>
-        <w:tab/>
-      </w:r>
-      <w:r>
-        <w:rPr>
-          <w:rFonts w:ascii="Times New Roman" w:hAnsi="Times New Roman"/>
-          <w:color w:val="000000" w:themeColor="text1"/>
-          <w:sz w:val="24"/>
-        </w:rPr>
-        <w:tab/>
-        <w:t>: _____________________________</w:t>
-      </w:r>
-    </w:p>
-    <w:p>
-      <w:pPr>
-        <w:spacing w:line="360" w:lineRule="auto"/>
-        <w:rPr>
-          <w:rFonts w:ascii="Times New Roman" w:hAnsi="Times New Roman"/>
-          <w:color w:val="000000" w:themeColor="text1"/>
-          <w:sz w:val="24"/>
-        </w:rPr>
-      </w:pPr>
-      <w:r>
-        <w:rPr>
-          <w:rFonts w:ascii="Times New Roman" w:hAnsi="Times New Roman"/>
-          <w:color w:val="000000" w:themeColor="text1"/>
-          <w:sz w:val="24"/>
-        </w:rPr>
+      </w:pPr>
+      <w:r>
         <w:t>ID No.</w:t>
-      </w:r>
-      <w:r>
-        <w:rPr>
-          <w:rFonts w:ascii="Times New Roman" w:hAnsi="Times New Roman"/>
-          <w:color w:val="000000" w:themeColor="text1"/>
-          <w:sz w:val="24"/>
-        </w:rPr>
-        <w:tab/>
-      </w:r>
-      <w:r>
-        <w:rPr>
-          <w:rFonts w:ascii="Times New Roman" w:hAnsi="Times New Roman"/>
-          <w:color w:val="000000" w:themeColor="text1"/>
-          <w:sz w:val="24"/>
-        </w:rPr>
-        <w:tab/>
-        <w:t>: _____________________________</w:t>
+        <w:tab/>
+        <w:tab/>
+        <w:t>: SWE2309520</w:t>
       </w:r>
     </w:p>
     <w:p>
@@ -1636,108 +1577,23 @@
     </w:p>
     <w:p>
       <w:pPr>
-        <w:spacing w:line="360" w:lineRule="auto"/>
-        <w:rPr>
-          <w:rFonts w:ascii="Times New Roman" w:hAnsi="Times New Roman"/>
-          <w:b/>
-          <w:sz w:val="24"/>
-        </w:rPr>
-      </w:pPr>
-      <w:r>
-        <w:rPr>
-          <w:rFonts w:ascii="Times New Roman" w:hAnsi="Times New Roman"/>
-          <w:color w:val="262626" w:themeColor="text1" w:themeTint="D9"/>
-          <w:sz w:val="24"/>
-        </w:rPr>
-        <w:t>I certify that this project report entitled “</w:t>
-      </w:r>
-      <w:r>
-        <w:rPr>
-          <w:rFonts w:ascii="Times New Roman" w:hAnsi="Times New Roman"/>
-          <w:b/>
-          <w:color w:val="262626" w:themeColor="text1" w:themeTint="D9"/>
-          <w:sz w:val="24"/>
-          <w:highlight w:val="yellow"/>
-        </w:rPr>
-        <w:t>TITLE TO BE THE SAME AS FRONT COVER, CAPITAL LETTER, BOLD</w:t>
-      </w:r>
-      <w:r>
-        <w:rPr>
-          <w:rFonts w:ascii="Times New Roman" w:hAnsi="Times New Roman"/>
-          <w:color w:val="262626" w:themeColor="text1" w:themeTint="D9"/>
-          <w:sz w:val="24"/>
-        </w:rPr>
-        <w:t xml:space="preserve">” </w:t>
-      </w:r>
-      <w:r>
-        <w:rPr>
-          <w:rFonts w:ascii="Times New Roman" w:hAnsi="Times New Roman"/>
-          <w:color w:val="262626" w:themeColor="text1" w:themeTint="D9"/>
-          <w:sz w:val="24"/>
-        </w:rPr>
-        <w:t xml:space="preserve">that </w:t>
-      </w:r>
-      <w:r>
-        <w:rPr>
-          <w:rFonts w:ascii="Times New Roman" w:hAnsi="Times New Roman"/>
-          <w:color w:val="262626" w:themeColor="text1" w:themeTint="D9"/>
-          <w:sz w:val="24"/>
-        </w:rPr>
-        <w:t xml:space="preserve">was prepared by </w:t>
-      </w:r>
-      <w:r>
-        <w:rPr>
-          <w:rFonts w:ascii="Times New Roman" w:hAnsi="Times New Roman"/>
-          <w:color w:val="262626" w:themeColor="text1" w:themeTint="D9"/>
-          <w:sz w:val="24"/>
-          <w:highlight w:val="yellow"/>
-        </w:rPr>
-        <w:t>STUDENT’S NAME</w:t>
-      </w:r>
-      <w:r>
-        <w:rPr>
-          <w:rFonts w:ascii="Times New Roman" w:hAnsi="Times New Roman"/>
-          <w:color w:val="262626" w:themeColor="text1" w:themeTint="D9"/>
-          <w:sz w:val="24"/>
-        </w:rPr>
-        <w:t xml:space="preserve"> has met the required standard for submission in partial fulfillment of the requirements for the award of </w:t>
-      </w:r>
-      <w:r>
-        <w:rPr>
-          <w:rFonts w:ascii="Times New Roman" w:hAnsi="Times New Roman"/>
-          <w:color w:val="262626" w:themeColor="text1" w:themeTint="D9"/>
-          <w:sz w:val="24"/>
-          <w:highlight w:val="yellow"/>
-        </w:rPr>
-        <w:t>Bachelor of Engineering in Digital Media Technology (</w:t>
-      </w:r>
-      <w:proofErr w:type="spellStart"/>
-      <w:r>
-        <w:rPr>
-          <w:rFonts w:ascii="Times New Roman" w:hAnsi="Times New Roman"/>
-          <w:color w:val="262626" w:themeColor="text1" w:themeTint="D9"/>
-          <w:sz w:val="24"/>
-          <w:highlight w:val="yellow"/>
-        </w:rPr>
-        <w:t>Honours</w:t>
-      </w:r>
-      <w:proofErr w:type="spellEnd"/>
-      <w:r>
-        <w:rPr>
-          <w:rFonts w:ascii="Times New Roman" w:hAnsi="Times New Roman"/>
-          <w:color w:val="262626" w:themeColor="text1" w:themeTint="D9"/>
-          <w:sz w:val="24"/>
-          <w:highlight w:val="yellow"/>
-        </w:rPr>
-        <w:t>)</w:t>
-      </w:r>
-      <w:r>
-        <w:rPr>
-          <w:rFonts w:ascii="Times New Roman" w:hAnsi="Times New Roman"/>
-          <w:color w:val="262626" w:themeColor="text1" w:themeTint="D9"/>
-          <w:sz w:val="24"/>
-        </w:rPr>
-        <w:t xml:space="preserve"> at Xiamen University Malaysia.</w:t>
+        <w:widowControl/>
+        <w:spacing w:line="360" w:lineRule="auto" w:before="0" w:after="240"/>
+        <w:ind w:left="0" w:right="0" w:firstLine="0"/>
+        <w:jc w:val="both"/>
+        <w:rPr>
+          <w:rFonts w:ascii="Times New Roman" w:hAnsi="Times New Roman"/>
+          <w:b/>
+          <w:sz w:val="24"/>
+        </w:rPr>
+      </w:pPr>
+      <w:r>
+        <w:rPr>
+          <w:rFonts w:ascii="Times New Roman" w:hAnsi="Times New Roman"/>
+          <w:b w:val="0"/>
+          <w:sz w:val="24"/>
+        </w:rPr>
+        <w:t>I certify that this project report entitled “A HYBRID RAG-FSM ARCHITECTURE FOR INTERNET-DELIVERED COGNITIVE BEHAVIORAL THERAPY FOR INSOMNIA” that was prepared by Li Ruibing has met the required standard for submission in partial fulfillment of the requirements for the award of Bachelor of Engineering in Software Engineering (Honours) at Xiamen University Malaysia.</w:t>
       </w:r>
     </w:p>
     <w:p>
@@ -1821,26 +1677,10 @@
         </w:rPr>
       </w:pPr>
       <w:r>
-        <w:rPr>
-          <w:rFonts w:ascii="Times New Roman" w:hAnsi="Times New Roman"/>
-          <w:sz w:val="24"/>
-        </w:rPr>
         <w:t>Supervisor</w:t>
-      </w:r>
-      <w:r>
-        <w:rPr>
-          <w:rFonts w:ascii="Times New Roman" w:hAnsi="Times New Roman"/>
-          <w:sz w:val="24"/>
-        </w:rPr>
-        <w:tab/>
-      </w:r>
-      <w:r>
-        <w:rPr>
-          <w:rFonts w:ascii="Times New Roman" w:hAnsi="Times New Roman"/>
-          <w:sz w:val="24"/>
-        </w:rPr>
-        <w:tab/>
-        <w:t>: Dr. XXXXXX</w:t>
+        <w:tab/>
+        <w:tab/>
+        <w:t>: Chandra Reka Ramachandiran</w:t>
       </w:r>
     </w:p>
     <w:p>
@@ -2110,35 +1950,7 @@
         </w:rPr>
       </w:pPr>
       <w:r>
-        <w:rPr>
-          <w:rFonts w:ascii="Times New Roman" w:hAnsi="Times New Roman"/>
-          <w:sz w:val="24"/>
-          <w:highlight w:val="yellow"/>
-        </w:rPr>
-        <w:t>©202</w:t>
-      </w:r>
-      <w:r>
-        <w:rPr>
-          <w:rFonts w:ascii="Times New Roman" w:hAnsi="Times New Roman"/>
-          <w:sz w:val="24"/>
-          <w:highlight w:val="yellow"/>
-        </w:rPr>
-        <w:t>6</w:t>
-      </w:r>
-      <w:r>
-        <w:rPr>
-          <w:rFonts w:ascii="Times New Roman" w:hAnsi="Times New Roman" w:hint="eastAsia"/>
-          <w:sz w:val="24"/>
-          <w:highlight w:val="yellow"/>
-        </w:rPr>
-        <w:t>, Name of Candidate.</w:t>
-      </w:r>
-      <w:r>
-        <w:rPr>
-          <w:rFonts w:ascii="Times New Roman" w:hAnsi="Times New Roman" w:hint="eastAsia"/>
-          <w:sz w:val="24"/>
-        </w:rPr>
-        <w:t xml:space="preserve"> All right reserved.</w:t>
+        <w:t>©2026, Li Ruibing. All rights reserved.</w:t>
       </w:r>
     </w:p>
     <w:p>
@@ -2412,29 +2224,7 @@
         </w:rPr>
       </w:pPr>
       <w:r>
-        <w:rPr>
-          <w:rFonts w:ascii="Times New Roman" w:hAnsi="Times New Roman"/>
-          <w:color w:val="000000" w:themeColor="text1"/>
-          <w:sz w:val="24"/>
-        </w:rPr>
-        <w:t xml:space="preserve">I would like to thank all who have contributed to the successful completion of this project. I would like to express my gratitude to my research supervisor, </w:t>
-      </w:r>
-      <w:r>
-        <w:rPr>
-          <w:rFonts w:ascii="Times New Roman" w:hAnsi="Times New Roman"/>
-          <w:color w:val="000000" w:themeColor="text1"/>
-          <w:sz w:val="24"/>
-          <w:highlight w:val="yellow"/>
-        </w:rPr>
-        <w:t>Prof. Dr. XXXXX for his</w:t>
-      </w:r>
-      <w:r>
-        <w:rPr>
-          <w:rFonts w:ascii="Times New Roman" w:hAnsi="Times New Roman"/>
-          <w:color w:val="000000" w:themeColor="text1"/>
-          <w:sz w:val="24"/>
-        </w:rPr>
-        <w:t xml:space="preserve"> invaluable advice, guidance and his enormous patience throughout the development of the research.</w:t>
+        <w:t>I would like to thank all who have contributed to the successful completion of this project. I would like to express my gratitude to my research supervisor, Chandra Reka Ramachandiran for his invaluable advice, guidance and his enormous patience throughout the development of the research.</w:t>
       </w:r>
     </w:p>
     <w:p>
@@ -4105,814 +3895,437 @@
     </w:p>
     <w:p>
       <w:pPr>
-        <w:spacing w:line="360" w:lineRule="auto"/>
-        <w:rPr>
-          <w:rFonts w:ascii="Times New Roman" w:hAnsi="Times New Roman"/>
-          <w:b/>
-          <w:sz w:val="24"/>
-        </w:rPr>
-      </w:pPr>
-      <w:r>
-        <w:rPr>
-          <w:rFonts w:ascii="Times New Roman" w:hAnsi="Times New Roman"/>
-          <w:b/>
-          <w:sz w:val="24"/>
-        </w:rPr>
-        <w:t>CHAPTER</w:t>
-      </w:r>
-    </w:p>
-    <w:p>
-      <w:pPr>
-        <w:spacing w:line="360" w:lineRule="auto"/>
-        <w:ind w:firstLine="420"/>
-        <w:rPr>
-          <w:rFonts w:ascii="Times New Roman" w:hAnsi="Times New Roman"/>
-          <w:b/>
-          <w:sz w:val="24"/>
-        </w:rPr>
-      </w:pPr>
-      <w:r>
-        <w:rPr>
-          <w:rFonts w:ascii="Times New Roman" w:hAnsi="Times New Roman" w:hint="eastAsia"/>
-          <w:b/>
-          <w:sz w:val="24"/>
-        </w:rPr>
-        <w:t>1</w:t>
-      </w:r>
-      <w:r>
-        <w:rPr>
-          <w:rFonts w:ascii="Times New Roman" w:hAnsi="Times New Roman" w:hint="eastAsia"/>
-          <w:b/>
-          <w:sz w:val="24"/>
-        </w:rPr>
-        <w:tab/>
-      </w:r>
-      <w:r>
-        <w:rPr>
-          <w:rFonts w:ascii="Times New Roman" w:hAnsi="Times New Roman"/>
-          <w:b/>
-          <w:sz w:val="24"/>
-        </w:rPr>
-        <w:t>INTRODUCTION</w:t>
-      </w:r>
-      <w:r>
-        <w:rPr>
-          <w:rFonts w:ascii="Times New Roman" w:hAnsi="Times New Roman"/>
-          <w:b/>
-          <w:sz w:val="24"/>
-        </w:rPr>
-        <w:tab/>
-      </w:r>
-      <w:r>
-        <w:rPr>
-          <w:rFonts w:ascii="Times New Roman" w:hAnsi="Times New Roman"/>
-          <w:b/>
-          <w:sz w:val="24"/>
-        </w:rPr>
-        <w:tab/>
-      </w:r>
-      <w:r>
-        <w:rPr>
-          <w:rFonts w:ascii="Times New Roman" w:hAnsi="Times New Roman"/>
-          <w:b/>
-          <w:sz w:val="24"/>
-        </w:rPr>
-        <w:tab/>
-      </w:r>
-      <w:r>
-        <w:rPr>
-          <w:rFonts w:ascii="Times New Roman" w:hAnsi="Times New Roman"/>
-          <w:b/>
-          <w:sz w:val="24"/>
-        </w:rPr>
-        <w:tab/>
-      </w:r>
-      <w:r>
-        <w:rPr>
-          <w:rFonts w:ascii="Times New Roman" w:hAnsi="Times New Roman"/>
-          <w:b/>
-          <w:sz w:val="24"/>
-        </w:rPr>
-        <w:tab/>
-      </w:r>
-      <w:r>
-        <w:rPr>
-          <w:rFonts w:ascii="Times New Roman" w:hAnsi="Times New Roman"/>
-          <w:b/>
-          <w:sz w:val="24"/>
-        </w:rPr>
-        <w:tab/>
-      </w:r>
-      <w:r>
-        <w:rPr>
-          <w:rFonts w:ascii="Times New Roman" w:hAnsi="Times New Roman"/>
-          <w:b/>
-          <w:sz w:val="24"/>
-        </w:rPr>
-        <w:tab/>
-      </w:r>
-      <w:r>
-        <w:rPr>
-          <w:rFonts w:ascii="Times New Roman" w:hAnsi="Times New Roman"/>
-          <w:b/>
-          <w:sz w:val="24"/>
-        </w:rPr>
-        <w:tab/>
-      </w:r>
-      <w:r>
-        <w:rPr>
-          <w:rFonts w:ascii="Times New Roman" w:hAnsi="Times New Roman"/>
-          <w:b/>
-          <w:sz w:val="24"/>
-        </w:rPr>
-        <w:tab/>
-      </w:r>
-      <w:r>
-        <w:rPr>
-          <w:rFonts w:ascii="Times New Roman" w:hAnsi="Times New Roman"/>
-          <w:b/>
-          <w:sz w:val="24"/>
-        </w:rPr>
-        <w:tab/>
-      </w:r>
-      <w:r>
-        <w:rPr>
-          <w:rFonts w:ascii="Times New Roman" w:hAnsi="Times New Roman"/>
-          <w:b/>
-          <w:sz w:val="24"/>
-        </w:rPr>
-        <w:tab/>
-      </w:r>
-      <w:r>
-        <w:rPr>
-          <w:rFonts w:ascii="Times New Roman" w:hAnsi="Times New Roman"/>
-          <w:b/>
-          <w:sz w:val="24"/>
-        </w:rPr>
-        <w:tab/>
-        <w:t>1</w:t>
-      </w:r>
-    </w:p>
-    <w:p>
-      <w:pPr>
-        <w:spacing w:line="360" w:lineRule="auto"/>
-        <w:ind w:firstLine="420"/>
-        <w:rPr>
-          <w:rFonts w:ascii="Times New Roman" w:hAnsi="Times New Roman"/>
-          <w:b/>
-          <w:sz w:val="24"/>
-        </w:rPr>
-      </w:pPr>
-      <w:r>
-        <w:rPr>
-          <w:rFonts w:ascii="Times New Roman" w:hAnsi="Times New Roman"/>
-          <w:sz w:val="24"/>
-        </w:rPr>
-        <w:tab/>
+        <w:widowControl/>
+        <w:tabs>
+          <w:tab w:pos="8208" w:val="right" w:leader="dot"/>
+        </w:tabs>
+        <w:spacing w:line="360" w:lineRule="auto" w:before="0" w:after="0"/>
+        <w:ind w:left="0" w:right="0" w:firstLine="0"/>
+        <w:jc w:val="left"/>
+      </w:pPr>
+      <w:r>
+        <w:rPr>
+          <w:rFonts w:ascii="Times New Roman" w:hAnsi="Times New Roman"/>
+          <w:b w:val="0"/>
+          <w:sz w:val="24"/>
+        </w:rPr>
+        <w:t>1  INTRODUCTION</w:t>
+      </w:r>
+      <w:r>
+        <w:tab/>
+      </w:r>
+      <w:r>
+        <w:fldChar w:fldCharType="begin" w:dirty="true"/>
+        <w:instrText xml:space="preserve"> PAGEREF Chapter1 \h </w:instrText>
+        <w:fldChar w:fldCharType="separate"/>
+        <w:t>—</w:t>
+        <w:fldChar w:fldCharType="end"/>
+      </w:r>
+    </w:p>
+    <w:p>
+      <w:pPr>
+        <w:widowControl/>
+        <w:tabs>
+          <w:tab w:pos="8208" w:val="right" w:leader="dot"/>
+        </w:tabs>
+        <w:spacing w:line="360" w:lineRule="auto" w:before="0" w:after="0"/>
+        <w:ind w:left="288" w:right="0" w:firstLine="0"/>
+        <w:jc w:val="left"/>
+      </w:pPr>
+      <w:r>
+        <w:rPr>
+          <w:rFonts w:ascii="Times New Roman" w:hAnsi="Times New Roman"/>
+          <w:b w:val="0"/>
+          <w:sz w:val="24"/>
+        </w:rPr>
         <w:t>1.1 Background</w:t>
       </w:r>
       <w:r>
-        <w:rPr>
-          <w:rFonts w:ascii="Times New Roman" w:hAnsi="Times New Roman"/>
-          <w:sz w:val="24"/>
-        </w:rPr>
-        <w:tab/>
-      </w:r>
-      <w:r>
-        <w:rPr>
-          <w:rFonts w:ascii="Times New Roman" w:hAnsi="Times New Roman"/>
-          <w:b/>
-          <w:sz w:val="24"/>
-        </w:rPr>
-        <w:tab/>
-      </w:r>
-      <w:r>
-        <w:rPr>
-          <w:rFonts w:ascii="Times New Roman" w:hAnsi="Times New Roman"/>
-          <w:b/>
-          <w:sz w:val="24"/>
-        </w:rPr>
-        <w:tab/>
-      </w:r>
-      <w:r>
-        <w:rPr>
-          <w:rFonts w:ascii="Times New Roman" w:hAnsi="Times New Roman"/>
-          <w:b/>
-          <w:sz w:val="24"/>
-        </w:rPr>
-        <w:tab/>
-      </w:r>
-      <w:r>
-        <w:rPr>
-          <w:rFonts w:ascii="Times New Roman" w:hAnsi="Times New Roman"/>
-          <w:b/>
-          <w:sz w:val="24"/>
-        </w:rPr>
-        <w:tab/>
-      </w:r>
-      <w:r>
-        <w:rPr>
-          <w:rFonts w:ascii="Times New Roman" w:hAnsi="Times New Roman"/>
-          <w:b/>
-          <w:sz w:val="24"/>
-        </w:rPr>
-        <w:tab/>
-      </w:r>
-      <w:r>
-        <w:rPr>
-          <w:rFonts w:ascii="Times New Roman" w:hAnsi="Times New Roman"/>
-          <w:b/>
-          <w:sz w:val="24"/>
-        </w:rPr>
-        <w:tab/>
-      </w:r>
-      <w:r>
-        <w:rPr>
-          <w:rFonts w:ascii="Times New Roman" w:hAnsi="Times New Roman"/>
-          <w:b/>
-          <w:sz w:val="24"/>
-        </w:rPr>
-        <w:tab/>
-      </w:r>
-      <w:r>
-        <w:rPr>
-          <w:rFonts w:ascii="Times New Roman" w:hAnsi="Times New Roman"/>
-          <w:b/>
-          <w:sz w:val="24"/>
-        </w:rPr>
-        <w:tab/>
-      </w:r>
-      <w:r>
-        <w:rPr>
-          <w:rFonts w:ascii="Times New Roman" w:hAnsi="Times New Roman"/>
-          <w:b/>
-          <w:sz w:val="24"/>
-        </w:rPr>
-        <w:tab/>
-      </w:r>
-      <w:r>
-        <w:rPr>
-          <w:rFonts w:ascii="Times New Roman" w:hAnsi="Times New Roman"/>
-          <w:b/>
-          <w:sz w:val="24"/>
-        </w:rPr>
-        <w:tab/>
-      </w:r>
-      <w:r>
-        <w:rPr>
-          <w:rFonts w:ascii="Times New Roman" w:hAnsi="Times New Roman"/>
-          <w:b/>
-          <w:sz w:val="24"/>
-        </w:rPr>
-        <w:tab/>
-      </w:r>
-      <w:r>
-        <w:rPr>
-          <w:rFonts w:ascii="Times New Roman" w:hAnsi="Times New Roman"/>
-          <w:b/>
-          <w:sz w:val="24"/>
-        </w:rPr>
-        <w:tab/>
-        <w:t>1</w:t>
-      </w:r>
-    </w:p>
-    <w:p>
-      <w:pPr>
-        <w:spacing w:line="360" w:lineRule="auto"/>
-        <w:ind w:firstLine="420"/>
-        <w:rPr>
-          <w:rFonts w:ascii="Times New Roman" w:hAnsi="Times New Roman"/>
-          <w:b/>
-          <w:sz w:val="24"/>
-        </w:rPr>
-      </w:pPr>
-    </w:p>
-    <w:p>
-      <w:pPr>
-        <w:spacing w:line="360" w:lineRule="auto"/>
-        <w:ind w:firstLine="420"/>
-        <w:rPr>
-          <w:rFonts w:ascii="Times New Roman" w:hAnsi="Times New Roman"/>
-          <w:b/>
-          <w:sz w:val="24"/>
-        </w:rPr>
-      </w:pPr>
-      <w:r>
-        <w:rPr>
-          <w:rFonts w:ascii="Times New Roman" w:hAnsi="Times New Roman"/>
-          <w:b/>
-          <w:sz w:val="24"/>
-        </w:rPr>
-        <w:t>2</w:t>
-      </w:r>
-      <w:r>
-        <w:rPr>
-          <w:rFonts w:ascii="Times New Roman" w:hAnsi="Times New Roman"/>
-          <w:b/>
-          <w:sz w:val="24"/>
-        </w:rPr>
-        <w:tab/>
-        <w:t>LITERATURE REVIEW</w:t>
-      </w:r>
-      <w:r>
-        <w:rPr>
-          <w:rFonts w:ascii="Times New Roman" w:hAnsi="Times New Roman"/>
-          <w:b/>
-          <w:sz w:val="24"/>
-        </w:rPr>
-        <w:tab/>
-      </w:r>
-      <w:r>
-        <w:rPr>
-          <w:rFonts w:ascii="Times New Roman" w:hAnsi="Times New Roman"/>
-          <w:b/>
-          <w:sz w:val="24"/>
-        </w:rPr>
-        <w:tab/>
-      </w:r>
-      <w:r>
-        <w:rPr>
-          <w:rFonts w:ascii="Times New Roman" w:hAnsi="Times New Roman"/>
-          <w:b/>
-          <w:sz w:val="24"/>
-        </w:rPr>
-        <w:tab/>
-      </w:r>
-      <w:r>
-        <w:rPr>
-          <w:rFonts w:ascii="Times New Roman" w:hAnsi="Times New Roman"/>
-          <w:b/>
-          <w:sz w:val="24"/>
-        </w:rPr>
-        <w:tab/>
-      </w:r>
-      <w:r>
-        <w:rPr>
-          <w:rFonts w:ascii="Times New Roman" w:hAnsi="Times New Roman"/>
-          <w:b/>
-          <w:sz w:val="24"/>
-        </w:rPr>
-        <w:tab/>
-      </w:r>
-      <w:r>
-        <w:rPr>
-          <w:rFonts w:ascii="Times New Roman" w:hAnsi="Times New Roman"/>
-          <w:b/>
-          <w:sz w:val="24"/>
-        </w:rPr>
-        <w:tab/>
-      </w:r>
-      <w:r>
-        <w:rPr>
-          <w:rFonts w:ascii="Times New Roman" w:hAnsi="Times New Roman"/>
-          <w:b/>
-          <w:sz w:val="24"/>
-        </w:rPr>
-        <w:tab/>
-      </w:r>
-      <w:r>
-        <w:rPr>
-          <w:rFonts w:ascii="Times New Roman" w:hAnsi="Times New Roman"/>
-          <w:b/>
-          <w:sz w:val="24"/>
-        </w:rPr>
-        <w:tab/>
-      </w:r>
-      <w:r>
-        <w:rPr>
-          <w:rFonts w:ascii="Times New Roman" w:hAnsi="Times New Roman"/>
-          <w:b/>
-          <w:sz w:val="24"/>
-        </w:rPr>
-        <w:tab/>
-      </w:r>
-      <w:r>
-        <w:rPr>
-          <w:rFonts w:ascii="Times New Roman" w:hAnsi="Times New Roman"/>
-          <w:b/>
-          <w:sz w:val="24"/>
-        </w:rPr>
-        <w:tab/>
-        <w:t>3</w:t>
-      </w:r>
-    </w:p>
-    <w:p>
-      <w:pPr>
-        <w:spacing w:line="360" w:lineRule="auto"/>
-        <w:ind w:firstLine="420"/>
-        <w:rPr>
-          <w:rFonts w:ascii="Times New Roman" w:hAnsi="Times New Roman"/>
-          <w:b/>
-          <w:sz w:val="24"/>
-        </w:rPr>
-      </w:pPr>
-      <w:r>
-        <w:rPr>
-          <w:rFonts w:ascii="Times New Roman" w:hAnsi="Times New Roman"/>
-          <w:sz w:val="24"/>
-        </w:rPr>
-        <w:tab/>
-        <w:t>2.1 Subsection Title 1</w:t>
-      </w:r>
-      <w:r>
-        <w:rPr>
-          <w:rFonts w:ascii="Times New Roman" w:hAnsi="Times New Roman"/>
-          <w:sz w:val="24"/>
-        </w:rPr>
-        <w:tab/>
-      </w:r>
-      <w:r>
-        <w:rPr>
-          <w:rFonts w:ascii="Times New Roman" w:hAnsi="Times New Roman"/>
-          <w:b/>
-          <w:sz w:val="24"/>
-        </w:rPr>
-        <w:tab/>
-      </w:r>
-      <w:r>
-        <w:rPr>
-          <w:rFonts w:ascii="Times New Roman" w:hAnsi="Times New Roman"/>
-          <w:b/>
-          <w:sz w:val="24"/>
-        </w:rPr>
-        <w:tab/>
-      </w:r>
-      <w:r>
-        <w:rPr>
-          <w:rFonts w:ascii="Times New Roman" w:hAnsi="Times New Roman"/>
-          <w:b/>
-          <w:sz w:val="24"/>
-        </w:rPr>
-        <w:tab/>
-      </w:r>
-      <w:r>
-        <w:rPr>
-          <w:rFonts w:ascii="Times New Roman" w:hAnsi="Times New Roman"/>
-          <w:b/>
-          <w:sz w:val="24"/>
-        </w:rPr>
-        <w:tab/>
-      </w:r>
-      <w:r>
-        <w:rPr>
-          <w:rFonts w:ascii="Times New Roman" w:hAnsi="Times New Roman"/>
-          <w:b/>
-          <w:sz w:val="24"/>
-        </w:rPr>
-        <w:tab/>
-      </w:r>
-      <w:r>
-        <w:rPr>
-          <w:rFonts w:ascii="Times New Roman" w:hAnsi="Times New Roman"/>
-          <w:b/>
-          <w:sz w:val="24"/>
-        </w:rPr>
-        <w:tab/>
-      </w:r>
-      <w:r>
-        <w:rPr>
-          <w:rFonts w:ascii="Times New Roman" w:hAnsi="Times New Roman"/>
-          <w:b/>
-          <w:sz w:val="24"/>
-        </w:rPr>
-        <w:tab/>
-      </w:r>
-      <w:r>
-        <w:rPr>
-          <w:rFonts w:ascii="Times New Roman" w:hAnsi="Times New Roman"/>
-          <w:b/>
-          <w:sz w:val="24"/>
-        </w:rPr>
-        <w:tab/>
-      </w:r>
-      <w:r>
-        <w:rPr>
-          <w:rFonts w:ascii="Times New Roman" w:hAnsi="Times New Roman"/>
-          <w:b/>
-          <w:sz w:val="24"/>
-        </w:rPr>
-        <w:tab/>
-      </w:r>
-      <w:r>
-        <w:rPr>
-          <w:rFonts w:ascii="Times New Roman" w:hAnsi="Times New Roman"/>
-          <w:b/>
-          <w:sz w:val="24"/>
-        </w:rPr>
-        <w:tab/>
-      </w:r>
-      <w:r>
-        <w:rPr>
-          <w:rFonts w:ascii="Times New Roman" w:hAnsi="Times New Roman"/>
-          <w:b/>
-          <w:sz w:val="24"/>
-        </w:rPr>
-        <w:tab/>
-        <w:t>4</w:t>
-      </w:r>
-    </w:p>
-    <w:p>
-      <w:pPr>
-        <w:spacing w:line="360" w:lineRule="auto"/>
-        <w:rPr>
-          <w:rFonts w:ascii="Times New Roman" w:hAnsi="Times New Roman"/>
-          <w:sz w:val="24"/>
-        </w:rPr>
-      </w:pPr>
-      <w:r>
-        <w:rPr>
-          <w:rFonts w:ascii="Times New Roman" w:hAnsi="Times New Roman"/>
-          <w:sz w:val="24"/>
-        </w:rPr>
-        <w:t>……</w:t>
-      </w:r>
-    </w:p>
-    <w:p>
-      <w:pPr>
-        <w:spacing w:line="360" w:lineRule="auto"/>
-        <w:rPr>
-          <w:rFonts w:ascii="Times New Roman" w:hAnsi="Times New Roman"/>
-          <w:b/>
-          <w:sz w:val="24"/>
-        </w:rPr>
-      </w:pPr>
-      <w:r>
-        <w:rPr>
-          <w:rFonts w:ascii="Times New Roman" w:hAnsi="Times New Roman"/>
-          <w:b/>
+        <w:tab/>
+      </w:r>
+      <w:r>
+        <w:fldChar w:fldCharType="begin" w:dirty="true"/>
+        <w:instrText xml:space="preserve"> PAGEREF Ch1_1_1 \h </w:instrText>
+        <w:fldChar w:fldCharType="separate"/>
+        <w:t>—</w:t>
+        <w:fldChar w:fldCharType="end"/>
+      </w:r>
+    </w:p>
+    <w:p>
+      <w:pPr>
+        <w:widowControl/>
+        <w:tabs>
+          <w:tab w:pos="8208" w:val="right" w:leader="dot"/>
+        </w:tabs>
+        <w:spacing w:line="360" w:lineRule="auto" w:before="0" w:after="0"/>
+        <w:ind w:left="288" w:right="0" w:firstLine="0"/>
+        <w:jc w:val="left"/>
+      </w:pPr>
+      <w:r>
+        <w:rPr>
+          <w:rFonts w:ascii="Times New Roman" w:hAnsi="Times New Roman"/>
+          <w:b w:val="0"/>
+          <w:sz w:val="24"/>
+        </w:rPr>
+        <w:t>1.2 Problem Statement and Justification</w:t>
+      </w:r>
+      <w:r>
+        <w:tab/>
+      </w:r>
+      <w:r>
+        <w:fldChar w:fldCharType="begin" w:dirty="true"/>
+        <w:instrText xml:space="preserve"> PAGEREF Ch1_1_2 \h </w:instrText>
+        <w:fldChar w:fldCharType="separate"/>
+        <w:t>—</w:t>
+        <w:fldChar w:fldCharType="end"/>
+      </w:r>
+    </w:p>
+    <w:p>
+      <w:pPr>
+        <w:widowControl/>
+        <w:tabs>
+          <w:tab w:pos="8208" w:val="right" w:leader="dot"/>
+        </w:tabs>
+        <w:spacing w:line="360" w:lineRule="auto" w:before="0" w:after="0"/>
+        <w:ind w:left="288" w:right="0" w:firstLine="0"/>
+        <w:jc w:val="left"/>
+      </w:pPr>
+      <w:r>
+        <w:rPr>
+          <w:rFonts w:ascii="Times New Roman" w:hAnsi="Times New Roman"/>
+          <w:b w:val="0"/>
+          <w:sz w:val="24"/>
+        </w:rPr>
+        <w:t>1.3 Aim and Objectives</w:t>
+      </w:r>
+      <w:r>
+        <w:tab/>
+      </w:r>
+      <w:r>
+        <w:fldChar w:fldCharType="begin" w:dirty="true"/>
+        <w:instrText xml:space="preserve"> PAGEREF Ch1_1_3 \h </w:instrText>
+        <w:fldChar w:fldCharType="separate"/>
+        <w:t>—</w:t>
+        <w:fldChar w:fldCharType="end"/>
+      </w:r>
+    </w:p>
+    <w:p>
+      <w:pPr>
+        <w:widowControl/>
+        <w:tabs>
+          <w:tab w:pos="8208" w:val="right" w:leader="dot"/>
+        </w:tabs>
+        <w:spacing w:line="360" w:lineRule="auto" w:before="0" w:after="0"/>
+        <w:ind w:left="288" w:right="0" w:firstLine="0"/>
+        <w:jc w:val="left"/>
+      </w:pPr>
+      <w:r>
+        <w:rPr>
+          <w:rFonts w:ascii="Times New Roman" w:hAnsi="Times New Roman"/>
+          <w:b w:val="0"/>
+          <w:sz w:val="24"/>
+        </w:rPr>
+        <w:t>1.4 Research Questions</w:t>
+      </w:r>
+      <w:r>
+        <w:tab/>
+      </w:r>
+      <w:r>
+        <w:fldChar w:fldCharType="begin" w:dirty="true"/>
+        <w:instrText xml:space="preserve"> PAGEREF Ch1_1_4 \h </w:instrText>
+        <w:fldChar w:fldCharType="separate"/>
+        <w:t>—</w:t>
+        <w:fldChar w:fldCharType="end"/>
+      </w:r>
+    </w:p>
+    <w:p>
+      <w:pPr>
+        <w:widowControl/>
+        <w:tabs>
+          <w:tab w:pos="8208" w:val="right" w:leader="dot"/>
+        </w:tabs>
+        <w:spacing w:line="360" w:lineRule="auto" w:before="0" w:after="0"/>
+        <w:ind w:left="288" w:right="0" w:firstLine="0"/>
+        <w:jc w:val="left"/>
+      </w:pPr>
+      <w:r>
+        <w:rPr>
+          <w:rFonts w:ascii="Times New Roman" w:hAnsi="Times New Roman"/>
+          <w:b w:val="0"/>
+          <w:sz w:val="24"/>
+        </w:rPr>
+        <w:t>1.5 Scope and Limitations</w:t>
+      </w:r>
+      <w:r>
+        <w:tab/>
+      </w:r>
+      <w:r>
+        <w:fldChar w:fldCharType="begin" w:dirty="true"/>
+        <w:instrText xml:space="preserve"> PAGEREF Ch1_1_5 \h </w:instrText>
+        <w:fldChar w:fldCharType="separate"/>
+        <w:t>—</w:t>
+        <w:fldChar w:fldCharType="end"/>
+      </w:r>
+    </w:p>
+    <w:p>
+      <w:pPr>
+        <w:widowControl/>
+        <w:tabs>
+          <w:tab w:pos="8208" w:val="right" w:leader="dot"/>
+        </w:tabs>
+        <w:spacing w:line="360" w:lineRule="auto" w:before="0" w:after="0"/>
+        <w:ind w:left="288" w:right="0" w:firstLine="0"/>
+        <w:jc w:val="left"/>
+      </w:pPr>
+      <w:r>
+        <w:rPr>
+          <w:rFonts w:ascii="Times New Roman" w:hAnsi="Times New Roman"/>
+          <w:b w:val="0"/>
+          <w:sz w:val="24"/>
+        </w:rPr>
+        <w:t>1.6 Significance and Expected Contributions</w:t>
+      </w:r>
+      <w:r>
+        <w:tab/>
+      </w:r>
+      <w:r>
+        <w:fldChar w:fldCharType="begin" w:dirty="true"/>
+        <w:instrText xml:space="preserve"> PAGEREF Ch1_1_6 \h </w:instrText>
+        <w:fldChar w:fldCharType="separate"/>
+        <w:t>—</w:t>
+        <w:fldChar w:fldCharType="end"/>
+      </w:r>
+    </w:p>
+    <w:p>
+      <w:pPr>
+        <w:widowControl/>
+        <w:tabs>
+          <w:tab w:pos="8208" w:val="right" w:leader="dot"/>
+        </w:tabs>
+        <w:spacing w:line="360" w:lineRule="auto" w:before="0" w:after="0"/>
+        <w:ind w:left="288" w:right="0" w:firstLine="0"/>
+        <w:jc w:val="left"/>
+      </w:pPr>
+      <w:r>
+        <w:rPr>
+          <w:rFonts w:ascii="Times New Roman" w:hAnsi="Times New Roman"/>
+          <w:b w:val="0"/>
+          <w:sz w:val="24"/>
+        </w:rPr>
+        <w:t>1.7 Overview of the Research Approach</w:t>
+      </w:r>
+      <w:r>
+        <w:tab/>
+      </w:r>
+      <w:r>
+        <w:fldChar w:fldCharType="begin" w:dirty="true"/>
+        <w:instrText xml:space="preserve"> PAGEREF Ch1_1_7 \h </w:instrText>
+        <w:fldChar w:fldCharType="separate"/>
+        <w:t>—</w:t>
+        <w:fldChar w:fldCharType="end"/>
+      </w:r>
+    </w:p>
+    <w:p>
+      <w:pPr>
+        <w:widowControl/>
+        <w:tabs>
+          <w:tab w:pos="8208" w:val="right" w:leader="dot"/>
+        </w:tabs>
+        <w:spacing w:line="360" w:lineRule="auto" w:before="0" w:after="0"/>
+        <w:ind w:left="288" w:right="0" w:firstLine="0"/>
+        <w:jc w:val="left"/>
+      </w:pPr>
+      <w:r>
+        <w:rPr>
+          <w:rFonts w:ascii="Times New Roman" w:hAnsi="Times New Roman"/>
+          <w:b w:val="0"/>
+          <w:sz w:val="24"/>
+        </w:rPr>
+        <w:t>1.8 Thesis Content</w:t>
+      </w:r>
+      <w:r>
+        <w:tab/>
+      </w:r>
+      <w:r>
+        <w:fldChar w:fldCharType="begin" w:dirty="true"/>
+        <w:instrText xml:space="preserve"> PAGEREF Ch1_1_8 \h </w:instrText>
+        <w:fldChar w:fldCharType="separate"/>
+        <w:t>—</w:t>
+        <w:fldChar w:fldCharType="end"/>
+      </w:r>
+    </w:p>
+    <w:p>
+      <w:pPr>
+        <w:widowControl/>
+        <w:tabs>
+          <w:tab w:pos="8208" w:val="right" w:leader="dot"/>
+        </w:tabs>
+        <w:spacing w:line="360" w:lineRule="auto" w:before="0" w:after="0"/>
+        <w:ind w:left="0" w:right="0" w:firstLine="0"/>
+        <w:jc w:val="left"/>
+      </w:pPr>
+      <w:r>
+        <w:rPr>
+          <w:rFonts w:ascii="Times New Roman" w:hAnsi="Times New Roman"/>
+          <w:b w:val="0"/>
+          <w:sz w:val="24"/>
+        </w:rPr>
+        <w:t>2  LITERATURE REVIEW</w:t>
+      </w:r>
+      <w:r>
+        <w:tab/>
+      </w:r>
+      <w:r>
+        <w:fldChar w:fldCharType="begin" w:dirty="true"/>
+        <w:instrText xml:space="preserve"> PAGEREF Chapter2 \h </w:instrText>
+        <w:fldChar w:fldCharType="separate"/>
+        <w:t>—</w:t>
+        <w:fldChar w:fldCharType="end"/>
+      </w:r>
+    </w:p>
+    <w:p>
+      <w:pPr>
+        <w:widowControl/>
+        <w:tabs>
+          <w:tab w:pos="8208" w:val="right" w:leader="dot"/>
+        </w:tabs>
+        <w:spacing w:line="360" w:lineRule="auto" w:before="0" w:after="0"/>
+        <w:ind w:left="0" w:right="0" w:firstLine="0"/>
+        <w:jc w:val="left"/>
+      </w:pPr>
+      <w:r>
+        <w:rPr>
+          <w:rFonts w:ascii="Times New Roman" w:hAnsi="Times New Roman"/>
+          <w:b w:val="0"/>
+          <w:sz w:val="24"/>
+        </w:rPr>
+        <w:t>3  RESEARCH METHODOLOGY</w:t>
+      </w:r>
+      <w:r>
+        <w:tab/>
+      </w:r>
+      <w:r>
+        <w:fldChar w:fldCharType="begin" w:dirty="true"/>
+        <w:instrText xml:space="preserve"> PAGEREF Chapter3 \h </w:instrText>
+        <w:fldChar w:fldCharType="separate"/>
+        <w:t>—</w:t>
+        <w:fldChar w:fldCharType="end"/>
+      </w:r>
+    </w:p>
+    <w:p>
+      <w:pPr>
+        <w:widowControl/>
+        <w:tabs>
+          <w:tab w:pos="8208" w:val="right" w:leader="dot"/>
+        </w:tabs>
+        <w:spacing w:line="360" w:lineRule="auto" w:before="0" w:after="0"/>
+        <w:ind w:left="0" w:right="0" w:firstLine="0"/>
+        <w:jc w:val="left"/>
+      </w:pPr>
+      <w:r>
+        <w:rPr>
+          <w:rFonts w:ascii="Times New Roman" w:hAnsi="Times New Roman"/>
+          <w:b w:val="0"/>
+          <w:sz w:val="24"/>
+        </w:rPr>
+        <w:t>4  RESULTS AND DISCUSSION</w:t>
+      </w:r>
+      <w:r>
+        <w:tab/>
+      </w:r>
+      <w:r>
+        <w:fldChar w:fldCharType="begin" w:dirty="true"/>
+        <w:instrText xml:space="preserve"> PAGEREF Chapter4 \h </w:instrText>
+        <w:fldChar w:fldCharType="separate"/>
+        <w:t>—</w:t>
+        <w:fldChar w:fldCharType="end"/>
+      </w:r>
+    </w:p>
+    <w:p>
+      <w:pPr>
+        <w:widowControl/>
+        <w:tabs>
+          <w:tab w:pos="8208" w:val="right" w:leader="dot"/>
+        </w:tabs>
+        <w:spacing w:line="360" w:lineRule="auto" w:before="0" w:after="0"/>
+        <w:ind w:left="0" w:right="0" w:firstLine="0"/>
+        <w:jc w:val="left"/>
+      </w:pPr>
+      <w:r>
+        <w:rPr>
+          <w:rFonts w:ascii="Times New Roman" w:hAnsi="Times New Roman"/>
+          <w:b w:val="0"/>
+          <w:sz w:val="24"/>
+        </w:rPr>
+        <w:t>5  CONCLUSION</w:t>
+      </w:r>
+      <w:r>
+        <w:tab/>
+      </w:r>
+      <w:r>
+        <w:fldChar w:fldCharType="begin" w:dirty="true"/>
+        <w:instrText xml:space="preserve"> PAGEREF Chapter5 \h </w:instrText>
+        <w:fldChar w:fldCharType="separate"/>
+        <w:t>—</w:t>
+        <w:fldChar w:fldCharType="end"/>
+      </w:r>
+    </w:p>
+    <w:p>
+      <w:pPr>
+        <w:widowControl/>
+        <w:tabs>
+          <w:tab w:pos="8208" w:val="right" w:leader="dot"/>
+        </w:tabs>
+        <w:spacing w:line="360" w:lineRule="auto" w:before="0" w:after="0"/>
+        <w:ind w:left="0" w:right="0" w:firstLine="0"/>
+        <w:jc w:val="left"/>
+      </w:pPr>
+      <w:r>
+        <w:rPr>
+          <w:rFonts w:ascii="Times New Roman" w:hAnsi="Times New Roman"/>
+          <w:b w:val="0"/>
           <w:sz w:val="24"/>
         </w:rPr>
         <w:t>REFERENCES</w:t>
       </w:r>
       <w:r>
-        <w:rPr>
-          <w:rFonts w:ascii="Times New Roman" w:hAnsi="Times New Roman"/>
-          <w:b/>
-          <w:sz w:val="24"/>
-        </w:rPr>
-        <w:tab/>
-      </w:r>
-      <w:r>
-        <w:rPr>
-          <w:rFonts w:ascii="Times New Roman" w:hAnsi="Times New Roman"/>
-          <w:b/>
-          <w:sz w:val="24"/>
-        </w:rPr>
-        <w:tab/>
-      </w:r>
-      <w:r>
-        <w:rPr>
-          <w:rFonts w:ascii="Times New Roman" w:hAnsi="Times New Roman"/>
-          <w:b/>
-          <w:sz w:val="24"/>
-        </w:rPr>
-        <w:tab/>
-      </w:r>
-      <w:r>
-        <w:rPr>
-          <w:rFonts w:ascii="Times New Roman" w:hAnsi="Times New Roman"/>
-          <w:b/>
-          <w:sz w:val="24"/>
-        </w:rPr>
-        <w:tab/>
-      </w:r>
-      <w:r>
-        <w:rPr>
-          <w:rFonts w:ascii="Times New Roman" w:hAnsi="Times New Roman"/>
-          <w:b/>
-          <w:sz w:val="24"/>
-        </w:rPr>
-        <w:tab/>
-      </w:r>
-      <w:r>
-        <w:rPr>
-          <w:rFonts w:ascii="Times New Roman" w:hAnsi="Times New Roman"/>
-          <w:b/>
-          <w:sz w:val="24"/>
-        </w:rPr>
-        <w:tab/>
-      </w:r>
-      <w:r>
-        <w:rPr>
-          <w:rFonts w:ascii="Times New Roman" w:hAnsi="Times New Roman"/>
-          <w:b/>
-          <w:sz w:val="24"/>
-        </w:rPr>
-        <w:tab/>
-      </w:r>
-      <w:r>
-        <w:rPr>
-          <w:rFonts w:ascii="Times New Roman" w:hAnsi="Times New Roman"/>
-          <w:b/>
-          <w:sz w:val="24"/>
-        </w:rPr>
-        <w:tab/>
-      </w:r>
-      <w:r>
-        <w:rPr>
-          <w:rFonts w:ascii="Times New Roman" w:hAnsi="Times New Roman"/>
-          <w:b/>
-          <w:sz w:val="24"/>
-        </w:rPr>
-        <w:tab/>
-      </w:r>
-      <w:r>
-        <w:rPr>
-          <w:rFonts w:ascii="Times New Roman" w:hAnsi="Times New Roman"/>
-          <w:b/>
-          <w:sz w:val="24"/>
-        </w:rPr>
-        <w:tab/>
-      </w:r>
-      <w:r>
-        <w:rPr>
-          <w:rFonts w:ascii="Times New Roman" w:hAnsi="Times New Roman"/>
-          <w:b/>
-          <w:sz w:val="24"/>
-        </w:rPr>
-        <w:tab/>
-      </w:r>
-      <w:r>
-        <w:rPr>
-          <w:rFonts w:ascii="Times New Roman" w:hAnsi="Times New Roman"/>
-          <w:b/>
-          <w:sz w:val="24"/>
-        </w:rPr>
-        <w:tab/>
-      </w:r>
-      <w:r>
-        <w:rPr>
-          <w:rFonts w:ascii="Times New Roman" w:hAnsi="Times New Roman"/>
-          <w:b/>
-          <w:sz w:val="24"/>
-        </w:rPr>
-        <w:tab/>
-      </w:r>
-      <w:r>
-        <w:rPr>
-          <w:rFonts w:ascii="Times New Roman" w:hAnsi="Times New Roman"/>
-          <w:b/>
-          <w:sz w:val="24"/>
-        </w:rPr>
-        <w:tab/>
-      </w:r>
-      <w:r>
-        <w:rPr>
-          <w:rFonts w:ascii="Times New Roman" w:hAnsi="Times New Roman"/>
-          <w:b/>
-          <w:sz w:val="24"/>
-        </w:rPr>
-        <w:tab/>
-        <w:t>82</w:t>
-      </w:r>
-    </w:p>
-    <w:p>
-      <w:pPr>
-        <w:spacing w:line="360" w:lineRule="auto"/>
-        <w:rPr>
-          <w:rFonts w:ascii="Times New Roman" w:hAnsi="Times New Roman"/>
-          <w:b/>
-          <w:sz w:val="24"/>
-        </w:rPr>
-      </w:pPr>
-    </w:p>
-    <w:p>
-      <w:pPr>
-        <w:spacing w:line="360" w:lineRule="auto"/>
-        <w:rPr>
-          <w:rFonts w:ascii="Times New Roman" w:hAnsi="Times New Roman"/>
-          <w:b/>
-          <w:sz w:val="24"/>
-        </w:rPr>
-      </w:pPr>
-      <w:r>
-        <w:rPr>
-          <w:rFonts w:ascii="Times New Roman" w:hAnsi="Times New Roman"/>
-          <w:b/>
-          <w:sz w:val="24"/>
-        </w:rPr>
-        <w:t>APPENDICES</w:t>
-      </w:r>
-      <w:r>
-        <w:rPr>
-          <w:rFonts w:ascii="Times New Roman" w:hAnsi="Times New Roman"/>
-          <w:b/>
-          <w:sz w:val="24"/>
-        </w:rPr>
-        <w:tab/>
-      </w:r>
-      <w:r>
-        <w:rPr>
-          <w:rFonts w:ascii="Times New Roman" w:hAnsi="Times New Roman"/>
-          <w:b/>
-          <w:sz w:val="24"/>
-        </w:rPr>
-        <w:tab/>
-      </w:r>
-      <w:r>
-        <w:rPr>
-          <w:rFonts w:ascii="Times New Roman" w:hAnsi="Times New Roman"/>
-          <w:b/>
-          <w:sz w:val="24"/>
-        </w:rPr>
-        <w:tab/>
-      </w:r>
-      <w:r>
-        <w:rPr>
-          <w:rFonts w:ascii="Times New Roman" w:hAnsi="Times New Roman"/>
-          <w:b/>
-          <w:sz w:val="24"/>
-        </w:rPr>
-        <w:tab/>
-      </w:r>
-      <w:r>
-        <w:rPr>
-          <w:rFonts w:ascii="Times New Roman" w:hAnsi="Times New Roman"/>
-          <w:b/>
-          <w:sz w:val="24"/>
-        </w:rPr>
-        <w:tab/>
-      </w:r>
-      <w:r>
-        <w:rPr>
-          <w:rFonts w:ascii="Times New Roman" w:hAnsi="Times New Roman"/>
-          <w:b/>
-          <w:sz w:val="24"/>
-        </w:rPr>
-        <w:tab/>
-      </w:r>
-      <w:r>
-        <w:rPr>
-          <w:rFonts w:ascii="Times New Roman" w:hAnsi="Times New Roman"/>
-          <w:b/>
-          <w:sz w:val="24"/>
-        </w:rPr>
-        <w:tab/>
-      </w:r>
-      <w:r>
-        <w:rPr>
-          <w:rFonts w:ascii="Times New Roman" w:hAnsi="Times New Roman"/>
-          <w:b/>
-          <w:sz w:val="24"/>
-        </w:rPr>
-        <w:tab/>
-      </w:r>
-      <w:r>
-        <w:rPr>
-          <w:rFonts w:ascii="Times New Roman" w:hAnsi="Times New Roman"/>
-          <w:b/>
-          <w:sz w:val="24"/>
-        </w:rPr>
-        <w:tab/>
-      </w:r>
-      <w:r>
-        <w:rPr>
-          <w:rFonts w:ascii="Times New Roman" w:hAnsi="Times New Roman"/>
-          <w:b/>
-          <w:sz w:val="24"/>
-        </w:rPr>
-        <w:tab/>
-      </w:r>
-      <w:r>
-        <w:rPr>
-          <w:rFonts w:ascii="Times New Roman" w:hAnsi="Times New Roman"/>
-          <w:b/>
-          <w:sz w:val="24"/>
-        </w:rPr>
-        <w:tab/>
-      </w:r>
-      <w:r>
-        <w:rPr>
-          <w:rFonts w:ascii="Times New Roman" w:hAnsi="Times New Roman"/>
-          <w:b/>
-          <w:sz w:val="24"/>
-        </w:rPr>
-        <w:tab/>
-      </w:r>
-      <w:r>
-        <w:rPr>
-          <w:rFonts w:ascii="Times New Roman" w:hAnsi="Times New Roman"/>
-          <w:b/>
-          <w:sz w:val="24"/>
-        </w:rPr>
-        <w:tab/>
-      </w:r>
-      <w:r>
-        <w:rPr>
-          <w:rFonts w:ascii="Times New Roman" w:hAnsi="Times New Roman"/>
-          <w:b/>
-          <w:sz w:val="24"/>
-        </w:rPr>
-        <w:tab/>
-      </w:r>
-      <w:r>
-        <w:rPr>
-          <w:rFonts w:ascii="Times New Roman" w:hAnsi="Times New Roman"/>
-          <w:b/>
-          <w:sz w:val="24"/>
-        </w:rPr>
-        <w:tab/>
-        <w:t>87</w:t>
+        <w:tab/>
+      </w:r>
+      <w:r>
+        <w:fldChar w:fldCharType="begin" w:dirty="true"/>
+        <w:instrText xml:space="preserve"> PAGEREF References \h </w:instrText>
+        <w:fldChar w:fldCharType="separate"/>
+        <w:t>—</w:t>
+        <w:fldChar w:fldCharType="end"/>
+      </w:r>
+    </w:p>
+    <w:p>
+      <w:pPr>
+        <w:widowControl/>
+        <w:tabs>
+          <w:tab w:pos="8208" w:val="right" w:leader="dot"/>
+        </w:tabs>
+        <w:spacing w:line="360" w:lineRule="auto" w:before="0" w:after="0"/>
+        <w:ind w:left="0" w:right="0" w:firstLine="0"/>
+        <w:jc w:val="left"/>
+      </w:pPr>
+      <w:r>
+        <w:rPr>
+          <w:rFonts w:ascii="Times New Roman" w:hAnsi="Times New Roman"/>
+          <w:b w:val="0"/>
+          <w:sz w:val="24"/>
+        </w:rPr>
+        <w:t>APPENDIX A</w:t>
+      </w:r>
+      <w:r>
+        <w:tab/>
+      </w:r>
+      <w:r>
+        <w:fldChar w:fldCharType="begin" w:dirty="true"/>
+        <w:instrText xml:space="preserve"> PAGEREF AppendixA \h </w:instrText>
+        <w:fldChar w:fldCharType="separate"/>
+        <w:t>—</w:t>
+        <w:fldChar w:fldCharType="end"/>
       </w:r>
     </w:p>
     <w:p>
@@ -6486,172 +5899,182 @@
     </w:p>
     <w:p>
       <w:pPr>
-        <w:rPr>
-          <w:rFonts w:ascii="Times New Roman" w:hAnsi="Times New Roman"/>
-          <w:b/>
-          <w:sz w:val="24"/>
-        </w:rPr>
-      </w:pPr>
-      <w:r>
-        <w:rPr>
-          <w:rFonts w:ascii="Times New Roman" w:hAnsi="Times New Roman"/>
-          <w:i/>
-          <w:sz w:val="24"/>
-        </w:rPr>
-        <w:t>G</w:t>
-      </w:r>
-      <w:r>
-        <w:rPr>
-          <w:rFonts w:ascii="Times New Roman" w:hAnsi="Times New Roman"/>
-          <w:sz w:val="24"/>
-        </w:rPr>
-        <w:tab/>
-      </w:r>
-      <w:r>
-        <w:rPr>
-          <w:rFonts w:ascii="Times New Roman" w:hAnsi="Times New Roman"/>
-          <w:sz w:val="24"/>
-        </w:rPr>
-        <w:tab/>
-      </w:r>
-      <w:r>
-        <w:rPr>
-          <w:rFonts w:ascii="Times New Roman" w:hAnsi="Times New Roman"/>
-          <w:sz w:val="24"/>
-        </w:rPr>
-        <w:tab/>
-        <w:t>s</w:t>
-      </w:r>
-      <w:r>
-        <w:rPr>
-          <w:rFonts w:ascii="Times New Roman" w:hAnsi="Times New Roman"/>
-          <w:sz w:val="24"/>
-        </w:rPr>
-        <w:t>pecific mass flow rate, kg/s</w:t>
-      </w:r>
-    </w:p>
-    <w:p>
-      <w:pPr>
-        <w:spacing w:line="360" w:lineRule="auto"/>
-        <w:rPr>
-          <w:rFonts w:ascii="Times New Roman" w:hAnsi="Times New Roman"/>
-          <w:sz w:val="24"/>
-        </w:rPr>
-      </w:pPr>
-      <w:r>
-        <w:rPr>
-          <w:rFonts w:ascii="Times New Roman" w:hAnsi="Times New Roman"/>
-          <w:i/>
-          <w:sz w:val="24"/>
-        </w:rPr>
-        <w:t>h</w:t>
-      </w:r>
-      <w:r>
-        <w:rPr>
-          <w:rFonts w:ascii="Times New Roman" w:hAnsi="Times New Roman"/>
-          <w:sz w:val="24"/>
-        </w:rPr>
-        <w:tab/>
-      </w:r>
-      <w:r>
-        <w:rPr>
-          <w:rFonts w:ascii="Times New Roman" w:hAnsi="Times New Roman"/>
-          <w:sz w:val="24"/>
-        </w:rPr>
-        <w:tab/>
-      </w:r>
-      <w:r>
-        <w:rPr>
-          <w:rFonts w:ascii="Times New Roman" w:hAnsi="Times New Roman"/>
-          <w:sz w:val="24"/>
-        </w:rPr>
-        <w:tab/>
-        <w:t>he</w:t>
-      </w:r>
-      <w:r>
-        <w:rPr>
-          <w:rFonts w:ascii="Times New Roman" w:hAnsi="Times New Roman"/>
-          <w:sz w:val="24"/>
-        </w:rPr>
-        <w:t>ight, m</w:t>
-      </w:r>
-    </w:p>
-    <w:p>
-      <w:pPr>
-        <w:spacing w:line="360" w:lineRule="auto"/>
-        <w:rPr>
-          <w:rFonts w:ascii="Times New Roman" w:hAnsi="Times New Roman"/>
-          <w:sz w:val="24"/>
-        </w:rPr>
-      </w:pPr>
-    </w:p>
-    <w:p>
-      <w:pPr>
-        <w:spacing w:line="360" w:lineRule="auto"/>
-        <w:rPr>
-          <w:rFonts w:ascii="Times New Roman" w:hAnsi="Times New Roman"/>
-          <w:sz w:val="24"/>
-        </w:rPr>
-      </w:pPr>
-      <w:r>
-        <w:rPr>
-          <w:rFonts w:ascii="Times New Roman" w:hAnsi="Times New Roman"/>
-          <w:sz w:val="24"/>
-        </w:rPr>
-        <w:t>MAP</w:t>
-      </w:r>
-      <w:r>
-        <w:rPr>
-          <w:rFonts w:ascii="Times New Roman" w:hAnsi="Times New Roman"/>
-          <w:sz w:val="24"/>
-        </w:rPr>
-        <w:tab/>
-      </w:r>
-      <w:r>
-        <w:rPr>
-          <w:rFonts w:ascii="Times New Roman" w:hAnsi="Times New Roman"/>
-          <w:sz w:val="24"/>
-        </w:rPr>
-        <w:tab/>
-        <w:t>maximum allowable pressure, kPa</w:t>
-      </w:r>
-    </w:p>
-    <w:p>
-      <w:pPr>
-        <w:spacing w:line="360" w:lineRule="auto"/>
-        <w:rPr>
-          <w:rFonts w:ascii="Times New Roman" w:hAnsi="Times New Roman"/>
-          <w:sz w:val="24"/>
-        </w:rPr>
-      </w:pPr>
-      <w:r>
-        <w:rPr>
-          <w:rFonts w:ascii="Times New Roman" w:hAnsi="Times New Roman"/>
-          <w:sz w:val="24"/>
-        </w:rPr>
-        <w:t>MAWP</w:t>
-      </w:r>
-      <w:r>
-        <w:rPr>
-          <w:rFonts w:ascii="Times New Roman" w:hAnsi="Times New Roman"/>
-          <w:sz w:val="24"/>
-        </w:rPr>
-        <w:tab/>
-      </w:r>
-      <w:r>
-        <w:rPr>
-          <w:rFonts w:ascii="Times New Roman" w:hAnsi="Times New Roman"/>
-          <w:sz w:val="24"/>
-        </w:rPr>
-        <w:tab/>
-        <w:t>m</w:t>
-      </w:r>
-      <w:r>
-        <w:rPr>
-          <w:rFonts w:ascii="Times New Roman" w:hAnsi="Times New Roman"/>
-          <w:sz w:val="24"/>
-        </w:rPr>
-        <w:t>aximum allowable working pressure, kPa</w:t>
+        <w:widowControl/>
+        <w:spacing w:line="360" w:lineRule="auto" w:before="0" w:after="0"/>
+        <w:ind w:left="0" w:right="0" w:firstLine="0"/>
+        <w:jc w:val="left"/>
+      </w:pPr>
+      <w:r>
+        <w:rPr>
+          <w:rFonts w:ascii="Times New Roman" w:hAnsi="Times New Roman"/>
+          <w:b w:val="0"/>
+          <w:sz w:val="24"/>
+        </w:rPr>
+        <w:t>CBT-I</w:t>
+        <w:tab/>
+        <w:t>cognitive behavioral therapy for insomnia</w:t>
+      </w:r>
+    </w:p>
+    <w:p>
+      <w:pPr>
+        <w:widowControl/>
+        <w:spacing w:line="360" w:lineRule="auto" w:before="0" w:after="0"/>
+        <w:ind w:left="0" w:right="0" w:firstLine="0"/>
+        <w:jc w:val="left"/>
+      </w:pPr>
+      <w:r>
+        <w:rPr>
+          <w:rFonts w:ascii="Times New Roman" w:hAnsi="Times New Roman"/>
+          <w:b w:val="0"/>
+          <w:sz w:val="24"/>
+        </w:rPr>
+        <w:t>FSM</w:t>
+        <w:tab/>
+        <w:t>finite state machine</w:t>
+      </w:r>
+    </w:p>
+    <w:p>
+      <w:pPr>
+        <w:widowControl/>
+        <w:spacing w:line="360" w:lineRule="auto" w:before="0" w:after="0"/>
+        <w:ind w:left="0" w:right="0" w:firstLine="0"/>
+        <w:jc w:val="left"/>
+      </w:pPr>
+      <w:r>
+        <w:rPr>
+          <w:rFonts w:ascii="Times New Roman" w:hAnsi="Times New Roman"/>
+          <w:b w:val="0"/>
+          <w:sz w:val="24"/>
+        </w:rPr>
+        <w:t>iCBT-I</w:t>
+        <w:tab/>
+        <w:t>internet-delivered cognitive behavioral therapy for insomnia</w:t>
+      </w:r>
+    </w:p>
+    <w:p>
+      <w:pPr>
+        <w:widowControl/>
+        <w:spacing w:line="360" w:lineRule="auto" w:before="0" w:after="0"/>
+        <w:ind w:left="0" w:right="0" w:firstLine="0"/>
+        <w:jc w:val="left"/>
+      </w:pPr>
+      <w:r>
+        <w:rPr>
+          <w:rFonts w:ascii="Times New Roman" w:hAnsi="Times New Roman"/>
+          <w:b w:val="0"/>
+          <w:sz w:val="24"/>
+        </w:rPr>
+        <w:t>KB</w:t>
+        <w:tab/>
+        <w:t>knowledge base</w:t>
+      </w:r>
+    </w:p>
+    <w:p>
+      <w:pPr>
+        <w:widowControl/>
+        <w:spacing w:line="360" w:lineRule="auto" w:before="0" w:after="0"/>
+        <w:ind w:left="0" w:right="0" w:firstLine="0"/>
+        <w:jc w:val="left"/>
+      </w:pPr>
+      <w:r>
+        <w:rPr>
+          <w:rFonts w:ascii="Times New Roman" w:hAnsi="Times New Roman"/>
+          <w:b w:val="0"/>
+          <w:sz w:val="24"/>
+        </w:rPr>
+        <w:t>LLM</w:t>
+        <w:tab/>
+        <w:t>large language model</w:t>
+      </w:r>
+    </w:p>
+    <w:p>
+      <w:pPr>
+        <w:widowControl/>
+        <w:spacing w:line="360" w:lineRule="auto" w:before="0" w:after="0"/>
+        <w:ind w:left="0" w:right="0" w:firstLine="0"/>
+        <w:jc w:val="left"/>
+      </w:pPr>
+      <w:r>
+        <w:rPr>
+          <w:rFonts w:ascii="Times New Roman" w:hAnsi="Times New Roman"/>
+          <w:b w:val="0"/>
+          <w:sz w:val="24"/>
+        </w:rPr>
+        <w:t>RAG</w:t>
+        <w:tab/>
+        <w:t>retrieval-augmented generation</w:t>
+      </w:r>
+    </w:p>
+    <w:p>
+      <w:pPr>
+        <w:widowControl/>
+        <w:spacing w:line="360" w:lineRule="auto" w:before="0" w:after="0"/>
+        <w:ind w:left="0" w:right="0" w:firstLine="0"/>
+        <w:jc w:val="left"/>
+      </w:pPr>
+      <w:r>
+        <w:rPr>
+          <w:rFonts w:ascii="Times New Roman" w:hAnsi="Times New Roman"/>
+          <w:b w:val="0"/>
+          <w:sz w:val="24"/>
+        </w:rPr>
+        <w:t>SE</w:t>
+        <w:tab/>
+        <w:t>sleep efficiency</w:t>
+      </w:r>
+    </w:p>
+    <w:p>
+      <w:pPr>
+        <w:widowControl/>
+        <w:spacing w:line="360" w:lineRule="auto" w:before="0" w:after="0"/>
+        <w:ind w:left="0" w:right="0" w:firstLine="0"/>
+        <w:jc w:val="left"/>
+      </w:pPr>
+      <w:r>
+        <w:rPr>
+          <w:rFonts w:ascii="Times New Roman" w:hAnsi="Times New Roman"/>
+          <w:b w:val="0"/>
+          <w:sz w:val="24"/>
+        </w:rPr>
+        <w:t>SUS</w:t>
+        <w:tab/>
+        <w:t>System Usability Scale</w:t>
+      </w:r>
+    </w:p>
+    <w:p>
+      <w:pPr>
+        <w:widowControl/>
+        <w:spacing w:line="360" w:lineRule="auto" w:before="0" w:after="0"/>
+        <w:ind w:left="0" w:right="0" w:firstLine="0"/>
+        <w:jc w:val="left"/>
+      </w:pPr>
+      <w:r>
+        <w:rPr>
+          <w:rFonts w:ascii="Times New Roman" w:hAnsi="Times New Roman"/>
+          <w:b w:val="0"/>
+          <w:sz w:val="24"/>
+        </w:rPr>
+        <w:t>TIB</w:t>
+        <w:tab/>
+        <w:t>time in bed</w:t>
+      </w:r>
+    </w:p>
+    <w:p>
+      <w:pPr>
+        <w:widowControl/>
+        <w:spacing w:line="360" w:lineRule="auto" w:before="0" w:after="0"/>
+        <w:ind w:left="0" w:right="0" w:firstLine="0"/>
+        <w:jc w:val="left"/>
+      </w:pPr>
+      <w:r>
+        <w:rPr>
+          <w:rFonts w:ascii="Times New Roman" w:hAnsi="Times New Roman"/>
+          <w:b w:val="0"/>
+          <w:sz w:val="24"/>
+        </w:rPr>
+        <w:t>TST</w:t>
+        <w:tab/>
+        <w:t>total sleep time</w:t>
       </w:r>
     </w:p>
     <w:p>
@@ -6944,14 +6367,18 @@
     </w:p>
     <w:p>
       <w:pPr>
-        <w:spacing w:afterLines="150" w:after="468" w:line="360" w:lineRule="auto"/>
-        <w:jc w:val="center"/>
-        <w:rPr>
-          <w:rFonts w:ascii="Times New Roman" w:hAnsi="Times New Roman"/>
-          <w:b/>
-          <w:sz w:val="24"/>
-        </w:rPr>
-      </w:pPr>
+        <w:keepNext/>
+        <w:widowControl/>
+        <w:spacing w:afterLines="150" w:after="240" w:line="360" w:lineRule="auto" w:before="0"/>
+        <w:ind w:left="0" w:right="0" w:firstLine="0"/>
+        <w:jc w:val="center"/>
+        <w:rPr>
+          <w:rFonts w:ascii="Times New Roman" w:hAnsi="Times New Roman"/>
+          <w:b/>
+          <w:sz w:val="24"/>
+        </w:rPr>
+      </w:pPr>
+      <w:bookmarkStart w:id="1009" w:name="Chapter1"/>
       <w:r>
         <w:rPr>
           <w:rFonts w:ascii="Times New Roman" w:hAnsi="Times New Roman"/>
@@ -6961,10 +6388,14 @@
         <w:lastRenderedPageBreak/>
         <w:t>CHAPTER 1</w:t>
       </w:r>
-    </w:p>
-    <w:p>
-      <w:pPr>
-        <w:spacing w:beforeLines="150" w:before="468" w:line="360" w:lineRule="auto"/>
+      <w:bookmarkEnd w:id="1009"/>
+    </w:p>
+    <w:p>
+      <w:pPr>
+        <w:keepNext/>
+        <w:widowControl/>
+        <w:spacing w:beforeLines="150" w:before="0" w:line="360" w:lineRule="auto" w:after="360"/>
+        <w:ind w:left="0" w:right="0" w:firstLine="0"/>
         <w:jc w:val="center"/>
         <w:rPr>
           <w:rFonts w:ascii="Times New Roman" w:hAnsi="Times New Roman"/>
@@ -6983,13 +6414,14 @@
     </w:p>
     <w:p>
       <w:pPr>
-        <w:spacing w:beforeLines="150" w:before="468" w:line="360" w:lineRule="auto"/>
-        <w:rPr>
-          <w:rFonts w:ascii="Times New Roman" w:hAnsi="Times New Roman"/>
-          <w:b/>
-          <w:sz w:val="24"/>
-        </w:rPr>
-      </w:pPr>
+        <w:keepNext/>
+        <w:widowControl/>
+        <w:spacing w:line="360" w:lineRule="auto" w:before="360" w:after="360"/>
+        <w:ind w:left="0" w:right="0" w:firstLine="0"/>
+        <w:jc w:val="left"/>
+        <w:outlineLvl w:val="1"/>
+      </w:pPr>
+      <w:bookmarkStart w:id="1001" w:name="Ch1_1_1"/>
       <w:r>
         <w:rPr>
           <w:rFonts w:ascii="Times New Roman" w:hAnsi="Times New Roman"/>
@@ -6998,878 +6430,776 @@
         </w:rPr>
         <w:t>1.1 Background</w:t>
       </w:r>
-    </w:p>
-    <w:p>
-      <w:pPr>
-        <w:spacing w:line="360" w:lineRule="auto"/>
-        <w:rPr>
-          <w:rFonts w:ascii="Times New Roman" w:hAnsi="Times New Roman"/>
-          <w:sz w:val="24"/>
-        </w:rPr>
-      </w:pPr>
-      <w:r>
-        <w:rPr>
-          <w:rFonts w:ascii="Times New Roman" w:hAnsi="Times New Roman"/>
-          <w:sz w:val="24"/>
-        </w:rPr>
-        <w:t>Spacing between title of subsection and first line of text is 1.5 lines. The first paragraph in a subsection should align with left margin.</w:t>
-      </w:r>
-    </w:p>
-    <w:p>
-      <w:pPr>
-        <w:spacing w:line="360" w:lineRule="auto"/>
-        <w:rPr>
-          <w:rFonts w:ascii="Times New Roman" w:hAnsi="Times New Roman"/>
-          <w:sz w:val="24"/>
-        </w:rPr>
-      </w:pPr>
-      <w:r>
-        <w:rPr>
-          <w:rFonts w:ascii="Times New Roman" w:hAnsi="Times New Roman"/>
-          <w:sz w:val="24"/>
-        </w:rPr>
-        <w:t>Spacing between last line of text and the next subsection title is 1.5 lines.</w:t>
-      </w:r>
-    </w:p>
-    <w:p>
-      <w:pPr>
-        <w:spacing w:beforeLines="150" w:before="468" w:line="360" w:lineRule="auto"/>
-        <w:rPr>
-          <w:rFonts w:ascii="Times New Roman" w:hAnsi="Times New Roman"/>
-          <w:b/>
-          <w:sz w:val="24"/>
-        </w:rPr>
-      </w:pPr>
-      <w:r>
-        <w:rPr>
-          <w:rFonts w:ascii="Times New Roman" w:hAnsi="Times New Roman" w:hint="eastAsia"/>
-          <w:b/>
-          <w:sz w:val="24"/>
-        </w:rPr>
-        <w:t>1.2 Aims and Objectives</w:t>
-      </w:r>
-    </w:p>
-    <w:p>
-      <w:pPr>
-        <w:spacing w:line="360" w:lineRule="auto"/>
-        <w:rPr>
-          <w:rFonts w:ascii="Times New Roman" w:hAnsi="Times New Roman"/>
-          <w:sz w:val="24"/>
-        </w:rPr>
-      </w:pPr>
-      <w:r>
-        <w:rPr>
-          <w:rFonts w:ascii="Times New Roman" w:hAnsi="Times New Roman"/>
-          <w:sz w:val="24"/>
-        </w:rPr>
-        <w:t xml:space="preserve">Spacing between title of subsection and first line of text is 1.5 lines. The first paragraph in a subsection should align with left margin. </w:t>
-      </w:r>
-    </w:p>
-    <w:p>
-      <w:pPr>
-        <w:spacing w:line="360" w:lineRule="auto"/>
-        <w:rPr>
-          <w:rFonts w:ascii="Times New Roman" w:hAnsi="Times New Roman"/>
-          <w:sz w:val="24"/>
-        </w:rPr>
-      </w:pPr>
-    </w:p>
-    <w:p>
-      <w:pPr>
-        <w:spacing w:line="360" w:lineRule="auto"/>
-        <w:rPr>
-          <w:rFonts w:ascii="Times New Roman" w:hAnsi="Times New Roman"/>
-          <w:sz w:val="24"/>
-        </w:rPr>
-      </w:pPr>
-    </w:p>
-    <w:p>
-      <w:pPr>
-        <w:spacing w:line="360" w:lineRule="auto"/>
-        <w:rPr>
-          <w:rFonts w:ascii="Times New Roman" w:hAnsi="Times New Roman"/>
-          <w:sz w:val="24"/>
-        </w:rPr>
-      </w:pPr>
-    </w:p>
-    <w:p>
-      <w:pPr>
-        <w:spacing w:line="360" w:lineRule="auto"/>
-        <w:rPr>
-          <w:rFonts w:ascii="Times New Roman" w:hAnsi="Times New Roman"/>
-          <w:sz w:val="24"/>
-        </w:rPr>
-      </w:pPr>
-    </w:p>
-    <w:p>
-      <w:pPr>
-        <w:spacing w:line="360" w:lineRule="auto"/>
-        <w:rPr>
-          <w:rFonts w:ascii="Times New Roman" w:hAnsi="Times New Roman"/>
-          <w:sz w:val="24"/>
-        </w:rPr>
-      </w:pPr>
-    </w:p>
-    <w:p>
-      <w:pPr>
-        <w:spacing w:line="360" w:lineRule="auto"/>
-        <w:rPr>
-          <w:rFonts w:ascii="Times New Roman" w:hAnsi="Times New Roman"/>
-          <w:sz w:val="24"/>
-        </w:rPr>
-      </w:pPr>
-    </w:p>
-    <w:p>
-      <w:pPr>
-        <w:spacing w:line="360" w:lineRule="auto"/>
-        <w:rPr>
-          <w:rFonts w:ascii="Times New Roman" w:hAnsi="Times New Roman"/>
-          <w:sz w:val="24"/>
-        </w:rPr>
-      </w:pPr>
-    </w:p>
-    <w:p>
-      <w:pPr>
-        <w:spacing w:line="360" w:lineRule="auto"/>
-        <w:rPr>
-          <w:rFonts w:ascii="Times New Roman" w:hAnsi="Times New Roman"/>
-          <w:sz w:val="24"/>
-        </w:rPr>
-      </w:pPr>
-    </w:p>
-    <w:p>
-      <w:pPr>
-        <w:spacing w:line="360" w:lineRule="auto"/>
-        <w:rPr>
-          <w:rFonts w:ascii="Times New Roman" w:hAnsi="Times New Roman"/>
-          <w:sz w:val="24"/>
-        </w:rPr>
-      </w:pPr>
-    </w:p>
-    <w:p>
-      <w:pPr>
-        <w:spacing w:line="360" w:lineRule="auto"/>
-        <w:rPr>
-          <w:rFonts w:ascii="Times New Roman" w:hAnsi="Times New Roman"/>
-          <w:sz w:val="24"/>
-        </w:rPr>
-      </w:pPr>
-    </w:p>
-    <w:p>
-      <w:pPr>
-        <w:spacing w:line="360" w:lineRule="auto"/>
-        <w:rPr>
-          <w:rFonts w:ascii="Times New Roman" w:hAnsi="Times New Roman"/>
-          <w:sz w:val="24"/>
-        </w:rPr>
-      </w:pPr>
-    </w:p>
-    <w:p>
-      <w:pPr>
-        <w:spacing w:line="360" w:lineRule="auto"/>
-        <w:rPr>
-          <w:rFonts w:ascii="Times New Roman" w:hAnsi="Times New Roman"/>
-          <w:sz w:val="24"/>
-        </w:rPr>
-      </w:pPr>
-    </w:p>
-    <w:p>
-      <w:pPr>
-        <w:spacing w:line="360" w:lineRule="auto"/>
-        <w:rPr>
-          <w:rFonts w:ascii="Times New Roman" w:hAnsi="Times New Roman"/>
-          <w:sz w:val="24"/>
-        </w:rPr>
-      </w:pPr>
-    </w:p>
-    <w:p>
-      <w:pPr>
-        <w:spacing w:line="360" w:lineRule="auto"/>
-        <w:rPr>
-          <w:rFonts w:ascii="Times New Roman" w:hAnsi="Times New Roman"/>
-          <w:sz w:val="24"/>
-        </w:rPr>
-      </w:pPr>
-    </w:p>
-    <w:p>
-      <w:pPr>
-        <w:spacing w:line="360" w:lineRule="auto"/>
-        <w:rPr>
-          <w:rFonts w:ascii="Times New Roman" w:hAnsi="Times New Roman"/>
-          <w:sz w:val="24"/>
-        </w:rPr>
-      </w:pPr>
-    </w:p>
-    <w:p>
-      <w:pPr>
-        <w:spacing w:line="360" w:lineRule="auto"/>
-        <w:rPr>
-          <w:rFonts w:ascii="Times New Roman" w:hAnsi="Times New Roman"/>
-          <w:sz w:val="24"/>
-        </w:rPr>
-      </w:pPr>
-    </w:p>
-    <w:p>
-      <w:pPr>
-        <w:spacing w:line="360" w:lineRule="auto"/>
-        <w:rPr>
-          <w:rFonts w:ascii="Times New Roman" w:hAnsi="Times New Roman"/>
-          <w:sz w:val="24"/>
-        </w:rPr>
-      </w:pPr>
-    </w:p>
-    <w:p>
-      <w:pPr>
-        <w:jc w:val="center"/>
-        <w:rPr>
-          <w:rFonts w:ascii="Times New Roman" w:hAnsi="Times New Roman"/>
-          <w:sz w:val="24"/>
-        </w:rPr>
-      </w:pPr>
-    </w:p>
-    <w:p>
-      <w:pPr>
-        <w:spacing w:beforeLines="150" w:before="468" w:line="360" w:lineRule="auto"/>
-        <w:rPr>
-          <w:rFonts w:ascii="Times New Roman" w:hAnsi="Times New Roman"/>
-          <w:b/>
-          <w:sz w:val="24"/>
-        </w:rPr>
-      </w:pPr>
-      <w:r>
-        <w:rPr>
-          <w:rFonts w:ascii="Times New Roman" w:hAnsi="Times New Roman" w:hint="eastAsia"/>
-          <w:b/>
-          <w:sz w:val="24"/>
-        </w:rPr>
-        <w:lastRenderedPageBreak/>
-        <w:t>1.</w:t>
-      </w:r>
-      <w:r>
-        <w:rPr>
-          <w:rFonts w:ascii="Times New Roman" w:hAnsi="Times New Roman"/>
-          <w:b/>
-          <w:sz w:val="24"/>
-        </w:rPr>
-        <w:t>3</w:t>
-      </w:r>
-      <w:r>
-        <w:rPr>
-          <w:rFonts w:ascii="Times New Roman" w:hAnsi="Times New Roman" w:hint="eastAsia"/>
-          <w:b/>
-          <w:sz w:val="24"/>
-        </w:rPr>
-        <w:t xml:space="preserve"> </w:t>
-      </w:r>
-      <w:r>
-        <w:rPr>
-          <w:rFonts w:ascii="Times New Roman" w:hAnsi="Times New Roman"/>
-          <w:b/>
-          <w:sz w:val="24"/>
-        </w:rPr>
-        <w:t>Thesis Content</w:t>
-      </w:r>
-    </w:p>
-    <w:p>
-      <w:pPr>
-        <w:spacing w:line="360" w:lineRule="auto"/>
-        <w:rPr>
-          <w:rFonts w:ascii="Times New Roman" w:hAnsi="Times New Roman"/>
-          <w:sz w:val="24"/>
-        </w:rPr>
-      </w:pPr>
-      <w:r>
-        <w:rPr>
-          <w:rFonts w:ascii="Times New Roman" w:hAnsi="Times New Roman"/>
-          <w:sz w:val="24"/>
-        </w:rPr>
-        <w:t>There is no restriction on the total number of chapters in a project report/ thesis. The number of chapters differs according to the field of study conducted by the candidate whether it is science-based or social-science-based. However, the content of the chapters may differ according to the candidate's research or conventions of individual School/ Faculty.</w:t>
-      </w:r>
-    </w:p>
-    <w:p>
-      <w:pPr>
-        <w:spacing w:line="360" w:lineRule="auto"/>
-        <w:rPr>
-          <w:rFonts w:ascii="Times New Roman" w:hAnsi="Times New Roman"/>
-          <w:sz w:val="24"/>
-        </w:rPr>
-      </w:pPr>
-    </w:p>
-    <w:p>
-      <w:pPr>
-        <w:spacing w:line="360" w:lineRule="auto"/>
-        <w:rPr>
-          <w:rFonts w:ascii="Times New Roman" w:hAnsi="Times New Roman"/>
-          <w:sz w:val="24"/>
-        </w:rPr>
-      </w:pPr>
-      <w:r>
-        <w:rPr>
-          <w:rFonts w:ascii="Times New Roman" w:hAnsi="Times New Roman"/>
-          <w:sz w:val="24"/>
-        </w:rPr>
-        <w:t>The body of the Project Report/ Thesis must be written in paragraphs. There must be continuity or logical flow among paragraphs. Long paragraphs are advised to be avoided.</w:t>
-      </w:r>
-    </w:p>
-    <w:p>
-      <w:pPr>
-        <w:spacing w:line="360" w:lineRule="auto"/>
-        <w:rPr>
-          <w:rFonts w:ascii="Times New Roman" w:hAnsi="Times New Roman"/>
-          <w:sz w:val="24"/>
-        </w:rPr>
-      </w:pPr>
-    </w:p>
-    <w:p>
-      <w:pPr>
-        <w:spacing w:line="360" w:lineRule="auto"/>
-        <w:rPr>
-          <w:rFonts w:ascii="Times New Roman" w:hAnsi="Times New Roman"/>
-          <w:sz w:val="24"/>
-        </w:rPr>
-      </w:pPr>
-      <w:r>
-        <w:rPr>
-          <w:rFonts w:ascii="Times New Roman" w:hAnsi="Times New Roman"/>
-          <w:sz w:val="24"/>
-        </w:rPr>
-        <w:t>Generally, a basic structure for the project report/ thesis is as below:</w:t>
-      </w:r>
-    </w:p>
-    <w:p>
-      <w:pPr>
-        <w:pStyle w:val="ListParagraph"/>
-        <w:numPr>
-          <w:ilvl w:val="0"/>
-          <w:numId w:val="1"/>
-        </w:numPr>
-        <w:spacing w:line="360" w:lineRule="auto"/>
-        <w:rPr>
-          <w:rFonts w:ascii="Times New Roman" w:hAnsi="Times New Roman"/>
-          <w:sz w:val="24"/>
-        </w:rPr>
-      </w:pPr>
-      <w:r>
-        <w:rPr>
-          <w:rFonts w:ascii="Times New Roman" w:hAnsi="Times New Roman"/>
-          <w:sz w:val="24"/>
-        </w:rPr>
-        <w:t>Introduction</w:t>
-      </w:r>
-    </w:p>
-    <w:p>
-      <w:pPr>
-        <w:pStyle w:val="ListParagraph"/>
-        <w:numPr>
-          <w:ilvl w:val="0"/>
-          <w:numId w:val="1"/>
-        </w:numPr>
-        <w:spacing w:line="360" w:lineRule="auto"/>
-        <w:rPr>
-          <w:rFonts w:ascii="Times New Roman" w:hAnsi="Times New Roman"/>
-          <w:sz w:val="24"/>
-        </w:rPr>
-      </w:pPr>
-      <w:r>
-        <w:rPr>
-          <w:rFonts w:ascii="Times New Roman" w:hAnsi="Times New Roman"/>
-          <w:sz w:val="24"/>
-        </w:rPr>
-        <w:t>Literature Review</w:t>
-      </w:r>
-    </w:p>
-    <w:p>
-      <w:pPr>
-        <w:pStyle w:val="ListParagraph"/>
-        <w:numPr>
-          <w:ilvl w:val="0"/>
-          <w:numId w:val="1"/>
-        </w:numPr>
-        <w:spacing w:line="360" w:lineRule="auto"/>
-        <w:rPr>
-          <w:rFonts w:ascii="Times New Roman" w:hAnsi="Times New Roman"/>
-          <w:sz w:val="24"/>
-        </w:rPr>
-      </w:pPr>
-      <w:r>
-        <w:rPr>
-          <w:rFonts w:ascii="Times New Roman" w:hAnsi="Times New Roman"/>
-          <w:sz w:val="24"/>
-        </w:rPr>
-        <w:t>Research Methodology</w:t>
-      </w:r>
-    </w:p>
-    <w:p>
-      <w:pPr>
-        <w:pStyle w:val="ListParagraph"/>
-        <w:numPr>
-          <w:ilvl w:val="0"/>
-          <w:numId w:val="1"/>
-        </w:numPr>
-        <w:spacing w:line="360" w:lineRule="auto"/>
-        <w:rPr>
-          <w:rFonts w:ascii="Times New Roman" w:hAnsi="Times New Roman"/>
-          <w:sz w:val="24"/>
-        </w:rPr>
-      </w:pPr>
-      <w:r>
-        <w:rPr>
-          <w:rFonts w:ascii="Times New Roman" w:hAnsi="Times New Roman"/>
-          <w:sz w:val="24"/>
-        </w:rPr>
-        <w:t>Results</w:t>
-      </w:r>
-    </w:p>
-    <w:p>
-      <w:pPr>
-        <w:pStyle w:val="ListParagraph"/>
-        <w:numPr>
-          <w:ilvl w:val="0"/>
-          <w:numId w:val="1"/>
-        </w:numPr>
-        <w:spacing w:line="360" w:lineRule="auto"/>
-        <w:rPr>
-          <w:rFonts w:ascii="Times New Roman" w:hAnsi="Times New Roman"/>
-          <w:sz w:val="24"/>
-        </w:rPr>
-      </w:pPr>
-      <w:r>
-        <w:rPr>
-          <w:rFonts w:ascii="Times New Roman" w:hAnsi="Times New Roman"/>
-          <w:sz w:val="24"/>
-        </w:rPr>
-        <w:t>Discussion</w:t>
-      </w:r>
-    </w:p>
-    <w:p>
-      <w:pPr>
-        <w:pStyle w:val="ListParagraph"/>
-        <w:numPr>
-          <w:ilvl w:val="0"/>
-          <w:numId w:val="1"/>
-        </w:numPr>
-        <w:spacing w:line="360" w:lineRule="auto"/>
-        <w:rPr>
-          <w:rFonts w:ascii="Times New Roman" w:hAnsi="Times New Roman"/>
-          <w:sz w:val="24"/>
-        </w:rPr>
-      </w:pPr>
-      <w:r>
-        <w:rPr>
-          <w:rFonts w:ascii="Times New Roman" w:hAnsi="Times New Roman"/>
-          <w:sz w:val="24"/>
-        </w:rPr>
-        <w:t>Conclusion and Recommendation</w:t>
-      </w:r>
-    </w:p>
-    <w:p>
-      <w:pPr>
-        <w:pStyle w:val="ListParagraph"/>
-        <w:numPr>
-          <w:ilvl w:val="0"/>
-          <w:numId w:val="1"/>
-        </w:numPr>
-        <w:spacing w:line="360" w:lineRule="auto"/>
-        <w:rPr>
-          <w:rFonts w:ascii="Times New Roman" w:hAnsi="Times New Roman"/>
-          <w:sz w:val="24"/>
-        </w:rPr>
-      </w:pPr>
-      <w:r>
-        <w:rPr>
-          <w:rFonts w:ascii="Times New Roman" w:hAnsi="Times New Roman"/>
-          <w:sz w:val="24"/>
-        </w:rPr>
-        <w:t>References</w:t>
-      </w:r>
-    </w:p>
-    <w:p>
-      <w:pPr>
-        <w:pStyle w:val="ListParagraph"/>
-        <w:spacing w:line="360" w:lineRule="auto"/>
-        <w:rPr>
-          <w:rFonts w:ascii="Times New Roman" w:hAnsi="Times New Roman"/>
-          <w:sz w:val="24"/>
-        </w:rPr>
-      </w:pPr>
-    </w:p>
-    <w:p>
-      <w:pPr>
-        <w:spacing w:line="360" w:lineRule="auto"/>
-        <w:rPr>
-          <w:rFonts w:ascii="Times New Roman" w:hAnsi="Times New Roman"/>
-          <w:sz w:val="24"/>
-        </w:rPr>
-      </w:pPr>
-      <w:r>
-        <w:rPr>
-          <w:rFonts w:ascii="Times New Roman" w:hAnsi="Times New Roman"/>
-          <w:sz w:val="24"/>
-        </w:rPr>
-        <w:t>The level of English writing must be appropriate to the level of the Bachelor’s degree. Attention should be paid to correct spelling, grammar, punctuation, sentence structure and clarity of style.</w:t>
-      </w:r>
-    </w:p>
-    <w:p>
-      <w:pPr>
-        <w:spacing w:line="360" w:lineRule="auto"/>
-        <w:rPr>
-          <w:rFonts w:ascii="Times New Roman" w:hAnsi="Times New Roman"/>
-          <w:sz w:val="24"/>
-        </w:rPr>
-      </w:pPr>
-    </w:p>
-    <w:p>
-      <w:pPr>
-        <w:spacing w:line="360" w:lineRule="auto"/>
-        <w:rPr>
-          <w:rFonts w:ascii="Times New Roman" w:hAnsi="Times New Roman"/>
-          <w:sz w:val="24"/>
-        </w:rPr>
-      </w:pPr>
-      <w:r>
-        <w:rPr>
-          <w:rFonts w:ascii="Times New Roman" w:hAnsi="Times New Roman"/>
-          <w:sz w:val="24"/>
-        </w:rPr>
-        <w:t>Normally, no first person references (e.g. I, we, us) shall appear in the report. If self-reference is required, reference may be made to “the author” or “this study”. Exceptions are acceptable in the conclusion section, where personal comments may be appropriate.</w:t>
-      </w:r>
-    </w:p>
-    <w:p>
-      <w:pPr>
-        <w:rPr>
-          <w:rFonts w:ascii="Arial Narrow" w:hAnsi="Arial Narrow"/>
-        </w:rPr>
-      </w:pPr>
-    </w:p>
-    <w:p>
-      <w:pPr>
-        <w:rPr>
-          <w:rFonts w:ascii="Arial Narrow" w:hAnsi="Arial Narrow"/>
-        </w:rPr>
-      </w:pPr>
-    </w:p>
-    <w:p>
-      <w:pPr>
-        <w:spacing w:afterLines="150" w:after="468" w:line="360" w:lineRule="auto"/>
-        <w:jc w:val="center"/>
-        <w:rPr>
-          <w:rFonts w:ascii="Times New Roman" w:hAnsi="Times New Roman"/>
-          <w:b/>
-          <w:sz w:val="24"/>
-        </w:rPr>
-      </w:pPr>
-    </w:p>
-    <w:p>
-      <w:pPr>
-        <w:spacing w:afterLines="150" w:after="468" w:line="360" w:lineRule="auto"/>
-        <w:jc w:val="center"/>
-        <w:rPr>
-          <w:rFonts w:ascii="Times New Roman" w:hAnsi="Times New Roman"/>
-          <w:b/>
-          <w:sz w:val="24"/>
-        </w:rPr>
-      </w:pPr>
-    </w:p>
-    <w:p>
-      <w:pPr>
-        <w:spacing w:afterLines="150" w:after="468" w:line="360" w:lineRule="auto"/>
-        <w:jc w:val="center"/>
-        <w:rPr>
-          <w:rFonts w:ascii="Times New Roman" w:hAnsi="Times New Roman"/>
-          <w:b/>
-          <w:sz w:val="24"/>
-        </w:rPr>
-      </w:pPr>
-    </w:p>
-    <w:p>
-      <w:pPr>
-        <w:spacing w:afterLines="150" w:after="468" w:line="360" w:lineRule="auto"/>
-        <w:jc w:val="center"/>
-        <w:rPr>
-          <w:rFonts w:ascii="Times New Roman" w:hAnsi="Times New Roman"/>
-          <w:b/>
-          <w:sz w:val="24"/>
-        </w:rPr>
-      </w:pPr>
-    </w:p>
-    <w:p>
-      <w:pPr>
-        <w:spacing w:afterLines="150" w:after="468" w:line="360" w:lineRule="auto"/>
-        <w:jc w:val="center"/>
-        <w:rPr>
-          <w:rFonts w:ascii="Times New Roman" w:hAnsi="Times New Roman"/>
-          <w:b/>
-          <w:sz w:val="24"/>
-        </w:rPr>
-      </w:pPr>
-    </w:p>
-    <w:p>
-      <w:pPr>
-        <w:spacing w:afterLines="150" w:after="468" w:line="360" w:lineRule="auto"/>
-        <w:jc w:val="center"/>
-        <w:rPr>
-          <w:rFonts w:ascii="Times New Roman" w:hAnsi="Times New Roman"/>
-          <w:b/>
-          <w:sz w:val="24"/>
-        </w:rPr>
-      </w:pPr>
-    </w:p>
-    <w:p>
-      <w:pPr>
-        <w:spacing w:afterLines="150" w:after="468" w:line="360" w:lineRule="auto"/>
-        <w:jc w:val="center"/>
-        <w:rPr>
-          <w:rFonts w:ascii="Times New Roman" w:hAnsi="Times New Roman"/>
-          <w:b/>
-          <w:sz w:val="24"/>
-        </w:rPr>
-      </w:pPr>
-    </w:p>
-    <w:p>
-      <w:pPr>
-        <w:spacing w:afterLines="150" w:after="468" w:line="360" w:lineRule="auto"/>
-        <w:jc w:val="center"/>
-        <w:rPr>
-          <w:rFonts w:ascii="Times New Roman" w:hAnsi="Times New Roman"/>
-          <w:b/>
-          <w:sz w:val="24"/>
-        </w:rPr>
-      </w:pPr>
-    </w:p>
-    <w:p>
-      <w:pPr>
-        <w:spacing w:afterLines="150" w:after="468" w:line="360" w:lineRule="auto"/>
-        <w:jc w:val="center"/>
-        <w:rPr>
-          <w:rFonts w:ascii="Times New Roman" w:hAnsi="Times New Roman"/>
-          <w:b/>
-          <w:sz w:val="24"/>
-        </w:rPr>
-      </w:pPr>
-    </w:p>
-    <w:p>
-      <w:pPr>
-        <w:spacing w:afterLines="150" w:after="468" w:line="360" w:lineRule="auto"/>
-        <w:jc w:val="center"/>
-        <w:rPr>
-          <w:rFonts w:ascii="Times New Roman" w:hAnsi="Times New Roman"/>
-          <w:b/>
-          <w:sz w:val="24"/>
-        </w:rPr>
-      </w:pPr>
-    </w:p>
-    <w:p>
-      <w:pPr>
-        <w:spacing w:afterLines="150" w:after="468" w:line="360" w:lineRule="auto"/>
-        <w:jc w:val="center"/>
-        <w:rPr>
-          <w:rFonts w:ascii="Times New Roman" w:hAnsi="Times New Roman"/>
-          <w:b/>
-          <w:sz w:val="24"/>
-        </w:rPr>
-      </w:pPr>
-    </w:p>
-    <w:p>
-      <w:pPr>
-        <w:spacing w:afterLines="150" w:after="468" w:line="360" w:lineRule="auto"/>
-        <w:jc w:val="center"/>
-        <w:rPr>
-          <w:rFonts w:ascii="Times New Roman" w:hAnsi="Times New Roman"/>
-          <w:b/>
-          <w:sz w:val="24"/>
-        </w:rPr>
-      </w:pPr>
-    </w:p>
-    <w:p>
-      <w:pPr>
-        <w:spacing w:afterLines="150" w:after="468" w:line="360" w:lineRule="auto"/>
-        <w:jc w:val="center"/>
-        <w:rPr>
-          <w:rFonts w:ascii="Times New Roman" w:hAnsi="Times New Roman"/>
-          <w:b/>
-          <w:sz w:val="24"/>
-        </w:rPr>
-      </w:pPr>
-    </w:p>
-    <w:p>
-      <w:pPr>
-        <w:spacing w:afterLines="150" w:after="468" w:line="360" w:lineRule="auto"/>
-        <w:jc w:val="center"/>
-        <w:rPr>
-          <w:rFonts w:ascii="Times New Roman" w:hAnsi="Times New Roman"/>
-          <w:b/>
-          <w:sz w:val="24"/>
-        </w:rPr>
-      </w:pPr>
-    </w:p>
-    <w:p>
-      <w:pPr>
-        <w:spacing w:afterLines="150" w:after="468" w:line="360" w:lineRule="auto"/>
-        <w:jc w:val="center"/>
-        <w:rPr>
-          <w:rFonts w:ascii="Times New Roman" w:hAnsi="Times New Roman"/>
-          <w:b/>
-          <w:sz w:val="24"/>
-        </w:rPr>
-      </w:pPr>
-    </w:p>
-    <w:p>
-      <w:pPr>
-        <w:spacing w:afterLines="150" w:after="468" w:line="360" w:lineRule="auto"/>
-        <w:jc w:val="center"/>
-        <w:rPr>
-          <w:rFonts w:ascii="Times New Roman" w:hAnsi="Times New Roman"/>
-          <w:b/>
-          <w:sz w:val="24"/>
-        </w:rPr>
-      </w:pPr>
-    </w:p>
-    <w:p>
-      <w:pPr>
-        <w:spacing w:afterLines="150" w:after="468" w:line="360" w:lineRule="auto"/>
-        <w:jc w:val="center"/>
-        <w:rPr>
-          <w:rFonts w:ascii="Times New Roman" w:hAnsi="Times New Roman"/>
-          <w:b/>
-          <w:sz w:val="24"/>
-        </w:rPr>
-      </w:pPr>
-    </w:p>
-    <w:p>
-      <w:pPr>
-        <w:spacing w:afterLines="150" w:after="468" w:line="360" w:lineRule="auto"/>
-        <w:jc w:val="center"/>
-        <w:rPr>
-          <w:rFonts w:ascii="Times New Roman" w:hAnsi="Times New Roman"/>
-          <w:b/>
-          <w:sz w:val="24"/>
-        </w:rPr>
-      </w:pPr>
-    </w:p>
-    <w:p>
-      <w:pPr>
-        <w:spacing w:afterLines="150" w:after="468" w:line="360" w:lineRule="auto"/>
-        <w:jc w:val="center"/>
-        <w:rPr>
-          <w:rFonts w:ascii="Times New Roman" w:hAnsi="Times New Roman"/>
-          <w:b/>
-          <w:sz w:val="24"/>
-        </w:rPr>
-      </w:pPr>
-    </w:p>
-    <w:p>
-      <w:pPr>
-        <w:spacing w:afterLines="150" w:after="468" w:line="360" w:lineRule="auto"/>
-        <w:jc w:val="center"/>
-        <w:rPr>
-          <w:rFonts w:ascii="Times New Roman" w:hAnsi="Times New Roman"/>
-          <w:b/>
-          <w:sz w:val="24"/>
-        </w:rPr>
-      </w:pPr>
-    </w:p>
-    <w:p>
-      <w:pPr>
-        <w:spacing w:afterLines="150" w:after="468" w:line="360" w:lineRule="auto"/>
-        <w:jc w:val="center"/>
-        <w:rPr>
-          <w:rFonts w:ascii="Times New Roman" w:hAnsi="Times New Roman"/>
-          <w:b/>
-          <w:sz w:val="24"/>
-        </w:rPr>
-      </w:pPr>
-    </w:p>
-    <w:p>
-      <w:pPr>
-        <w:spacing w:afterLines="150" w:after="468" w:line="360" w:lineRule="auto"/>
-        <w:jc w:val="center"/>
-        <w:rPr>
-          <w:rFonts w:ascii="Times New Roman" w:hAnsi="Times New Roman"/>
-          <w:b/>
-          <w:sz w:val="24"/>
-        </w:rPr>
-      </w:pPr>
-    </w:p>
-    <w:p>
-      <w:pPr>
-        <w:spacing w:afterLines="150" w:after="468" w:line="360" w:lineRule="auto"/>
-        <w:jc w:val="center"/>
-        <w:rPr>
-          <w:rFonts w:ascii="Times New Roman" w:hAnsi="Times New Roman"/>
-          <w:b/>
-          <w:sz w:val="24"/>
-        </w:rPr>
-      </w:pPr>
-    </w:p>
-    <w:p>
-      <w:pPr>
-        <w:spacing w:afterLines="150" w:after="468" w:line="360" w:lineRule="auto"/>
-        <w:jc w:val="center"/>
-        <w:rPr>
-          <w:rFonts w:ascii="Times New Roman" w:hAnsi="Times New Roman"/>
-          <w:b/>
-          <w:sz w:val="24"/>
-        </w:rPr>
-      </w:pPr>
-    </w:p>
-    <w:p>
-      <w:pPr>
-        <w:spacing w:afterLines="150" w:after="468" w:line="360" w:lineRule="auto"/>
-        <w:jc w:val="center"/>
-        <w:rPr>
-          <w:rFonts w:ascii="Times New Roman" w:hAnsi="Times New Roman"/>
-          <w:b/>
-          <w:sz w:val="24"/>
-        </w:rPr>
-      </w:pPr>
-    </w:p>
-    <w:p>
-      <w:pPr>
-        <w:spacing w:afterLines="150" w:after="468" w:line="360" w:lineRule="auto"/>
-        <w:jc w:val="center"/>
-        <w:rPr>
-          <w:rFonts w:ascii="Times New Roman" w:hAnsi="Times New Roman"/>
-          <w:b/>
-          <w:sz w:val="24"/>
-        </w:rPr>
-      </w:pPr>
-    </w:p>
-    <w:p>
-      <w:pPr>
-        <w:spacing w:afterLines="150" w:after="468" w:line="360" w:lineRule="auto"/>
-        <w:jc w:val="center"/>
-        <w:rPr>
-          <w:rFonts w:ascii="Times New Roman" w:hAnsi="Times New Roman"/>
-          <w:b/>
-          <w:sz w:val="24"/>
-        </w:rPr>
-      </w:pPr>
-    </w:p>
-    <w:p>
-      <w:pPr>
-        <w:spacing w:afterLines="150" w:after="468" w:line="360" w:lineRule="auto"/>
-        <w:jc w:val="center"/>
-        <w:rPr>
-          <w:rFonts w:ascii="Times New Roman" w:hAnsi="Times New Roman"/>
-          <w:b/>
-          <w:sz w:val="24"/>
-        </w:rPr>
-      </w:pPr>
-    </w:p>
-    <w:p>
-      <w:pPr>
-        <w:spacing w:afterLines="150" w:after="468" w:line="360" w:lineRule="auto"/>
-        <w:jc w:val="center"/>
-        <w:rPr>
-          <w:rFonts w:ascii="Times New Roman" w:hAnsi="Times New Roman"/>
-          <w:b/>
-          <w:sz w:val="24"/>
-        </w:rPr>
-      </w:pPr>
-    </w:p>
-    <w:p>
-      <w:pPr>
-        <w:spacing w:afterLines="150" w:after="468" w:line="360" w:lineRule="auto"/>
+      <w:bookmarkEnd w:id="1001"/>
+    </w:p>
+    <w:p>
+      <w:pPr>
+        <w:widowControl/>
+        <w:spacing w:line="360" w:lineRule="auto" w:before="0" w:after="240"/>
+        <w:ind w:left="0" w:right="0" w:firstLine="0"/>
+        <w:jc w:val="both"/>
+      </w:pPr>
+      <w:r>
+        <w:rPr>
+          <w:rFonts w:ascii="Times New Roman" w:hAnsi="Times New Roman"/>
+          <w:b w:val="0"/>
+          <w:sz w:val="24"/>
+        </w:rPr>
+        <w:t>Insomnia affects both sleep and daytime functioning, making the delivery of accessible, evidence-based support an important concern. Cognitive behavioral therapy for insomnia (CBT-I) addresses behavioral patterns and beliefs that maintain sleep difficulties. Its components include sleep restriction, stimulus control, sleep hygiene education, and cognitive restructuring. A review of psychological and behavioral treatments supports the effectiveness of these approaches (Morin et al., 2006). A dismantling trial also demonstrates the value of combining behavioral components rather than assuming that a single component provides an equivalent intervention (Epstein et al., 2012).</w:t>
+      </w:r>
+    </w:p>
+    <w:p>
+      <w:pPr>
+        <w:widowControl/>
+        <w:spacing w:line="360" w:lineRule="auto" w:before="0" w:after="240"/>
+        <w:ind w:left="0" w:right="0" w:firstLine="0"/>
+        <w:jc w:val="both"/>
+      </w:pPr>
+      <w:r>
+        <w:rPr>
+          <w:rFonts w:ascii="Times New Roman" w:hAnsi="Times New Roman"/>
+          <w:b w:val="0"/>
+          <w:sz w:val="24"/>
+        </w:rPr>
+        <w:t>CBT-I requires more than presenting general information about sleep. Behavioral activities depend on recorded sleep patterns, decisions about time in bed, and progress across repeated sessions. Cognitive work addresses beliefs such as rigid expectations about sleep duration, catastrophic predictions about daytime performance, and perceived helplessness. A conversational system intended to support these activities must therefore maintain an orderly workflow while responding appropriately to concerns that arise during an interaction.</w:t>
+      </w:r>
+    </w:p>
+    <w:p>
+      <w:pPr>
+        <w:widowControl/>
+        <w:spacing w:line="360" w:lineRule="auto" w:before="0" w:after="240"/>
+        <w:ind w:left="0" w:right="0" w:firstLine="0"/>
+        <w:jc w:val="both"/>
+      </w:pPr>
+      <w:r>
+        <w:rPr>
+          <w:rFonts w:ascii="Times New Roman" w:hAnsi="Times New Roman"/>
+          <w:b w:val="0"/>
+          <w:sz w:val="24"/>
+        </w:rPr>
+        <w:t>Internet-delivered CBT-I (iCBT-I) offers a way to deliver structured intervention content beyond face-to-face appointments. Automated online programs have been evaluated in randomized trials, including the web application studied by Espie et al. (2012). Ritterband et al. (2017) report outcomes from a web-based intervention with a one-year follow-up. These studies establish a basis for investigating digital delivery, although their findings do not demonstrate the effectiveness of every subsequent digital system or conversational architecture.</w:t>
+      </w:r>
+    </w:p>
+    <w:p>
+      <w:pPr>
+        <w:widowControl/>
+        <w:spacing w:line="360" w:lineRule="auto" w:before="0" w:after="240"/>
+        <w:ind w:left="0" w:right="0" w:firstLine="0"/>
+        <w:jc w:val="both"/>
+      </w:pPr>
+      <w:r>
+        <w:rPr>
+          <w:rFonts w:ascii="Times New Roman" w:hAnsi="Times New Roman"/>
+          <w:b w:val="0"/>
+          <w:sz w:val="24"/>
+        </w:rPr>
+        <w:t>Structured applications can support diaries and established intervention activities. For example, CBT-I Coach has been investigated as an adjunct for patients receiving CBT-I, with attention to feasibility and acceptability (Koffel et al., 2018). Such tools illustrate the usefulness of explicitly represented tasks. However, a conversational interface introduces a further requirement: the system must interpret varied user messages while preserving the data and rules needed for the current task. Merely offering a free-text input does not resolve that requirement.</w:t>
+      </w:r>
+    </w:p>
+    <w:p>
+      <w:pPr>
+        <w:widowControl/>
+        <w:spacing w:line="360" w:lineRule="auto" w:before="0" w:after="240"/>
+        <w:ind w:left="0" w:right="0" w:firstLine="0"/>
+        <w:jc w:val="both"/>
+      </w:pPr>
+      <w:r>
+        <w:rPr>
+          <w:rFonts w:ascii="Times New Roman" w:hAnsi="Times New Roman"/>
+          <w:b w:val="0"/>
+          <w:sz w:val="24"/>
+        </w:rPr>
+        <w:t>Large language models (LLMs) provide a means of generating context-sensitive responses and interpreting natural language. Their potential role in insomnia support has motivated work on dialogue systems and adaptation strategies, including the comparative evaluation by Bao et al. (2025). Nevertheless, fluent responses alone cannot establish that a workflow follows its intended protocol. When generation also controls stage progression, numerical calculations, and the selection of intervention content, errors in any of these responsibilities may be concealed within an apparently coherent reply.</w:t>
+      </w:r>
+    </w:p>
+    <w:p>
+      <w:pPr>
+        <w:widowControl/>
+        <w:spacing w:line="360" w:lineRule="auto" w:before="0" w:after="240"/>
+        <w:ind w:left="0" w:right="0" w:firstLine="0"/>
+        <w:jc w:val="both"/>
+      </w:pPr>
+      <w:r>
+        <w:rPr>
+          <w:rFonts w:ascii="Times New Roman" w:hAnsi="Times New Roman"/>
+          <w:b w:val="0"/>
+          <w:sz w:val="24"/>
+        </w:rPr>
+        <w:t>Retrieval-augmented generation (RAG) connects response generation to information retrieved from an external collection (Lewis et al., 2020). In this project, retrieval is intended to provide a traceable source of behavioral guidance and cognitive restructuring material. Retrieval does not itself define when a stage is complete, whether diary inputs are valid, or how a paused task should resume. These responsibilities require an explicit control mechanism alongside the generation and retrieval components.</w:t>
+      </w:r>
+    </w:p>
+    <w:p>
+      <w:pPr>
+        <w:widowControl/>
+        <w:spacing w:line="360" w:lineRule="auto" w:before="0" w:after="240"/>
+        <w:ind w:left="0" w:right="0" w:firstLine="0"/>
+        <w:jc w:val="both"/>
+      </w:pPr>
+      <w:r>
+        <w:rPr>
+          <w:rFonts w:ascii="Times New Roman" w:hAnsi="Times New Roman"/>
+          <w:b w:val="0"/>
+          <w:sz w:val="24"/>
+        </w:rPr>
+        <w:t>The FYP1 proposal therefore motivates a hybrid RAG-FSM architecture. A hierarchical finite state machine (FSM) manages behavioral progression, a deterministic calculator handles sleep-related arithmetic, and two separate knowledge bases support behavioral and cognitive content. A cognitive interrupt mechanism allows the system to address a relevant dysfunctional sleep belief and then return to the interrupted task. The present study develops and evaluates this architecture as a software prototype, focusing on observable system behavior and preliminary interface usability.</w:t>
+      </w:r>
+    </w:p>
+    <w:p>
+      <w:pPr>
+        <w:keepNext/>
+        <w:widowControl/>
+        <w:spacing w:line="360" w:lineRule="auto" w:before="360" w:after="360"/>
+        <w:ind w:left="0" w:right="0" w:firstLine="0"/>
+        <w:jc w:val="left"/>
+        <w:outlineLvl w:val="1"/>
+      </w:pPr>
+      <w:bookmarkStart w:id="1002" w:name="Ch1_1_2"/>
+      <w:r>
+        <w:rPr>
+          <w:rFonts w:ascii="Times New Roman" w:hAnsi="Times New Roman"/>
+          <w:b/>
+          <w:sz w:val="24"/>
+        </w:rPr>
+        <w:t>1.2 Problem Statement and Justification</w:t>
+      </w:r>
+      <w:bookmarkEnd w:id="1002"/>
+    </w:p>
+    <w:p>
+      <w:pPr>
+        <w:widowControl/>
+        <w:spacing w:line="360" w:lineRule="auto" w:before="0" w:after="240"/>
+        <w:ind w:left="0" w:right="0" w:firstLine="0"/>
+        <w:jc w:val="both"/>
+      </w:pPr>
+      <w:r>
+        <w:rPr>
+          <w:rFonts w:ascii="Times New Roman" w:hAnsi="Times New Roman"/>
+          <w:b w:val="0"/>
+          <w:sz w:val="24"/>
+        </w:rPr>
+        <w:t>The central problem is how to combine flexible natural-language interaction with dependable execution of a structured iCBT-I workflow. The behavioral and cognitive parts of the proposed system have different control requirements. Behavioral tasks require defined prerequisites, persistent diary data, and guarded transitions. Cognitive restructuring requires context-sensitive dialogue that may be needed before the current behavioral task is complete. Treating both activities as an unrestricted sequence of generated responses makes their interaction difficult to inspect and test.</w:t>
+      </w:r>
+    </w:p>
+    <w:p>
+      <w:pPr>
+        <w:widowControl/>
+        <w:spacing w:line="360" w:lineRule="auto" w:before="0" w:after="240"/>
+        <w:ind w:left="0" w:right="0" w:firstLine="0"/>
+        <w:jc w:val="both"/>
+      </w:pPr>
+      <w:r>
+        <w:rPr>
+          <w:rFonts w:ascii="Times New Roman" w:hAnsi="Times New Roman"/>
+          <w:b w:val="0"/>
+          <w:sz w:val="24"/>
+        </w:rPr>
+        <w:t>The first architectural concern is workflow drift. A user may provide incomplete diary information, ask an unrelated question, or request guidance associated with a later stage. The system needs to distinguish a valid transition from a conversational detour. Progress should be determined by the defined rules and available data, rather than by the model's tendency to continue a plausible conversation. This motivates an FSM layer in which states, transition conditions, and retained variables are explicitly represented.</w:t>
+      </w:r>
+    </w:p>
+    <w:p>
+      <w:pPr>
+        <w:widowControl/>
+        <w:spacing w:line="360" w:lineRule="auto" w:before="0" w:after="240"/>
+        <w:ind w:left="0" w:right="0" w:firstLine="0"/>
+        <w:jc w:val="both"/>
+      </w:pPr>
+      <w:r>
+        <w:rPr>
+          <w:rFonts w:ascii="Times New Roman" w:hAnsi="Times New Roman"/>
+          <w:b w:val="0"/>
+          <w:sz w:val="24"/>
+        </w:rPr>
+        <w:t>The second concern is numerical consistency. Sleep diary interpretation and sleep-window calculations involve quantities such as total sleep time, time in bed, and sleep efficiency. A generated explanation must not become the authoritative source of these calculations. The prototype therefore requires a deterministic calculation component with validated inputs and independently specified expected outputs. Agreement with that component is a software correctness criterion; it does not establish that a calculated sleep window is appropriate for an individual patient.</w:t>
+      </w:r>
+    </w:p>
+    <w:p>
+      <w:pPr>
+        <w:widowControl/>
+        <w:spacing w:line="360" w:lineRule="auto" w:before="0" w:after="240"/>
+        <w:ind w:left="0" w:right="0" w:firstLine="0"/>
+        <w:jc w:val="both"/>
+      </w:pPr>
+      <w:r>
+        <w:rPr>
+          <w:rFonts w:ascii="Times New Roman" w:hAnsi="Times New Roman"/>
+          <w:b w:val="0"/>
+          <w:sz w:val="24"/>
+        </w:rPr>
+        <w:t>The third concern is the separation of behavioral and cognitive knowledge. Behavioral retrieval should supply material relevant to the permitted workflow activity, while cognitive retrieval should supply material relevant to an identified belief. If the two retrieval routes are mixed without clear boundaries, responses may include content inappropriate to the active task. Separate knowledge bases and explicit routing provide a testable design for controlling which material each component may use. The effectiveness of this separation still needs to be evaluated through retrieval-isolation tests.</w:t>
+      </w:r>
+    </w:p>
+    <w:p>
+      <w:pPr>
+        <w:widowControl/>
+        <w:spacing w:line="360" w:lineRule="auto" w:before="0" w:after="240"/>
+        <w:ind w:left="0" w:right="0" w:firstLine="0"/>
+        <w:jc w:val="both"/>
+      </w:pPr>
+      <w:r>
+        <w:rPr>
+          <w:rFonts w:ascii="Times New Roman" w:hAnsi="Times New Roman"/>
+          <w:b w:val="0"/>
+          <w:sz w:val="24"/>
+        </w:rPr>
+        <w:t>The fourth concern is interruption and recovery. A statement expressing a dysfunctional sleep belief may justify temporarily suspending a behavioral task, whereas ordinary tiredness, grief, or a factual question may not justify cognitive restructuring. Both missed triggers and unnecessary triggers can disrupt the interaction. After an interrupt, the system must recover the appropriate behavioral state and its associated data. A response that simply announces a return to the task is insufficient if the underlying state or pending information has been lost.</w:t>
+      </w:r>
+    </w:p>
+    <w:p>
+      <w:pPr>
+        <w:widowControl/>
+        <w:spacing w:line="360" w:lineRule="auto" w:before="0" w:after="240"/>
+        <w:ind w:left="0" w:right="0" w:firstLine="0"/>
+        <w:jc w:val="both"/>
+      </w:pPr>
+      <w:r>
+        <w:rPr>
+          <w:rFonts w:ascii="Times New Roman" w:hAnsi="Times New Roman"/>
+          <w:b w:val="0"/>
+          <w:sz w:val="24"/>
+        </w:rPr>
+        <w:t>Together, these concerns motivate an architectural investigation of explicit state control, separate retrieval routes, deterministic calculations, and checkpoint-based recovery. The study tests whether this combination improves the specified behaviors relative to a linear LLM-RAG baseline using the same model and knowledge resources. Its research gap is framed as the need to evaluate this particular integration for the selected iCBT-I tasks. It does not assume that a hybrid architecture guarantees clinical safety, eliminates hallucinations, or constitutes the first possible implementation of every individual component.</w:t>
+      </w:r>
+    </w:p>
+    <w:p>
+      <w:pPr>
+        <w:keepNext/>
+        <w:widowControl/>
+        <w:spacing w:line="360" w:lineRule="auto" w:before="360" w:after="360"/>
+        <w:ind w:left="0" w:right="0" w:firstLine="0"/>
+        <w:jc w:val="left"/>
+        <w:outlineLvl w:val="1"/>
+      </w:pPr>
+      <w:bookmarkStart w:id="1003" w:name="Ch1_1_3"/>
+      <w:r>
+        <w:rPr>
+          <w:rFonts w:ascii="Times New Roman" w:hAnsi="Times New Roman"/>
+          <w:b/>
+          <w:sz w:val="24"/>
+        </w:rPr>
+        <w:t>1.3 Aim and Objectives</w:t>
+      </w:r>
+      <w:bookmarkEnd w:id="1003"/>
+    </w:p>
+    <w:p>
+      <w:pPr>
+        <w:widowControl/>
+        <w:spacing w:line="360" w:lineRule="auto" w:before="0" w:after="240"/>
+        <w:ind w:left="0" w:right="0" w:firstLine="0"/>
+        <w:jc w:val="both"/>
+      </w:pPr>
+      <w:r>
+        <w:rPr>
+          <w:rFonts w:ascii="Times New Roman" w:hAnsi="Times New Roman"/>
+          <w:b w:val="0"/>
+          <w:sz w:val="24"/>
+        </w:rPr>
+        <w:t>The aim of this project is to design, develop, and evaluate an iCBT-I dialogue-system prototype that integrates RAG with hierarchical FSM orchestration to support consistent behavioral workflow execution and context-sensitive cognitive restructuring. The emphasis is on the reliability of the software architecture under specified test conditions.</w:t>
+      </w:r>
+    </w:p>
+    <w:p>
+      <w:pPr>
+        <w:widowControl/>
+        <w:spacing w:line="360" w:lineRule="auto" w:before="0" w:after="240"/>
+        <w:ind w:left="0" w:right="0" w:firstLine="0"/>
+        <w:jc w:val="both"/>
+      </w:pPr>
+      <w:r>
+        <w:rPr>
+          <w:rFonts w:ascii="Times New Roman" w:hAnsi="Times New Roman"/>
+          <w:b w:val="0"/>
+          <w:sz w:val="24"/>
+        </w:rPr>
+        <w:t>Objective 1 is to develop an integrated prototype comprising a LangGraph-based FSM, separate behavioral and cognitive retrieval pipelines, persistent dialogue state, and a conversational interface. Completion will be assessed through end-to-end scenarios demonstrating that the components exchange the required data and that each retrieval route uses its designated knowledge base.</w:t>
+      </w:r>
+    </w:p>
+    <w:p>
+      <w:pPr>
+        <w:widowControl/>
+        <w:spacing w:line="360" w:lineRule="auto" w:before="0" w:after="240"/>
+        <w:ind w:left="0" w:right="0" w:firstLine="0"/>
+        <w:jc w:val="both"/>
+      </w:pPr>
+      <w:r>
+        <w:rPr>
+          <w:rFonts w:ascii="Times New Roman" w:hAnsi="Times New Roman"/>
+          <w:b w:val="0"/>
+          <w:sz w:val="24"/>
+        </w:rPr>
+        <w:t>Objective 2 is to implement a structured behavioral workflow with validated sleep diary inputs, guarded stage transitions, and a deterministic sleep-window calculator independent of the LLM. The proposal sets targets of at least 95% FSM transition accuracy and 100% prescription precision. Prescription precision refers to agreement with independently defined calculation outputs on the evaluated cases, rather than a claim of clinical accuracy across patients.</w:t>
+      </w:r>
+    </w:p>
+    <w:p>
+      <w:pPr>
+        <w:widowControl/>
+        <w:spacing w:line="360" w:lineRule="auto" w:before="0" w:after="240"/>
+        <w:ind w:left="0" w:right="0" w:firstLine="0"/>
+        <w:jc w:val="both"/>
+      </w:pPr>
+      <w:r>
+        <w:rPr>
+          <w:rFonts w:ascii="Times New Roman" w:hAnsi="Times New Roman"/>
+          <w:b w:val="0"/>
+          <w:sz w:val="24"/>
+        </w:rPr>
+        <w:t>Objective 3 is to implement and evaluate a cognitive interrupt mechanism that detects relevant dysfunctional sleep beliefs, invokes the cognitive retrieval route, and restores the interrupted behavioral context. The proposal specifies interrupt precision of at least 80%, interrupt recall of at least 75%, and contextual recoverability of at least 90%. Positive, negative, and recovery scenarios will be used to assess these behaviors.</w:t>
+      </w:r>
+    </w:p>
+    <w:p>
+      <w:pPr>
+        <w:widowControl/>
+        <w:spacing w:line="360" w:lineRule="auto" w:before="0" w:after="240"/>
+        <w:ind w:left="0" w:right="0" w:firstLine="0"/>
+        <w:jc w:val="both"/>
+      </w:pPr>
+      <w:r>
+        <w:rPr>
+          <w:rFonts w:ascii="Times New Roman" w:hAnsi="Times New Roman"/>
+          <w:b w:val="0"/>
+          <w:sz w:val="24"/>
+        </w:rPr>
+        <w:t>Objective 4 is to evaluate the integrated prototype through scripted dialogues and a controlled comparison with a linear LLM-RAG baseline, and to conduct a supplementary usability assessment of the interface. The architectural measures will be reported alongside observed failures and test conditions. The proposed usability assessment involves 5–10 peer volunteers completing scripted tasks and the System Usability Scale (SUS), with a target score above 68. These figures are planned evaluation targets, not achieved results.</w:t>
+      </w:r>
+    </w:p>
+    <w:p>
+      <w:pPr>
+        <w:keepNext/>
+        <w:widowControl/>
+        <w:spacing w:line="360" w:lineRule="auto" w:before="360" w:after="360"/>
+        <w:ind w:left="0" w:right="0" w:firstLine="0"/>
+        <w:jc w:val="left"/>
+        <w:outlineLvl w:val="1"/>
+      </w:pPr>
+      <w:bookmarkStart w:id="1004" w:name="Ch1_1_4"/>
+      <w:r>
+        <w:rPr>
+          <w:rFonts w:ascii="Times New Roman" w:hAnsi="Times New Roman"/>
+          <w:b/>
+          <w:sz w:val="24"/>
+        </w:rPr>
+        <w:t>1.4 Research Questions</w:t>
+      </w:r>
+      <w:bookmarkEnd w:id="1004"/>
+    </w:p>
+    <w:p>
+      <w:pPr>
+        <w:widowControl/>
+        <w:spacing w:line="360" w:lineRule="auto" w:before="0" w:after="240"/>
+        <w:ind w:left="0" w:right="0" w:firstLine="0"/>
+        <w:jc w:val="both"/>
+      </w:pPr>
+      <w:r>
+        <w:rPr>
+          <w:rFonts w:ascii="Times New Roman" w:hAnsi="Times New Roman"/>
+          <w:b w:val="0"/>
+          <w:sz w:val="24"/>
+        </w:rPr>
+        <w:t>The research questions translate the aim into observable architectural behaviors. They also define the evidence needed to determine whether the proposed integration addresses the problem statement.</w:t>
+      </w:r>
+    </w:p>
+    <w:p>
+      <w:pPr>
+        <w:widowControl/>
+        <w:spacing w:line="360" w:lineRule="auto" w:before="0" w:after="240"/>
+        <w:ind w:left="0" w:right="0" w:firstLine="0"/>
+        <w:jc w:val="both"/>
+      </w:pPr>
+      <w:r>
+        <w:rPr>
+          <w:rFonts w:ascii="Times New Roman" w:hAnsi="Times New Roman"/>
+          <w:b w:val="0"/>
+          <w:sz w:val="24"/>
+        </w:rPr>
+        <w:t>RQ1: To what extent does hierarchical FSM orchestration preserve the specified behavioral progression under compliant inputs, conversational deviations, and contradictory diary inputs, compared with a linear LLM-RAG baseline?</w:t>
+      </w:r>
+    </w:p>
+    <w:p>
+      <w:pPr>
+        <w:widowControl/>
+        <w:spacing w:line="360" w:lineRule="auto" w:before="0" w:after="240"/>
+        <w:ind w:left="0" w:right="0" w:firstLine="0"/>
+        <w:jc w:val="both"/>
+      </w:pPr>
+      <w:r>
+        <w:rPr>
+          <w:rFonts w:ascii="Times New Roman" w:hAnsi="Times New Roman"/>
+          <w:b w:val="0"/>
+          <w:sz w:val="24"/>
+        </w:rPr>
+        <w:t>RQ2: Can the integrated prototype reproduce independently specified sleep-window calculation outputs while keeping numerical decision-making outside the LLM and maintaining separation between behavioral and cognitive retrieval?</w:t>
+      </w:r>
+    </w:p>
+    <w:p>
+      <w:pPr>
+        <w:widowControl/>
+        <w:spacing w:line="360" w:lineRule="auto" w:before="0" w:after="240"/>
+        <w:ind w:left="0" w:right="0" w:firstLine="0"/>
+        <w:jc w:val="both"/>
+      </w:pPr>
+      <w:r>
+        <w:rPr>
+          <w:rFonts w:ascii="Times New Roman" w:hAnsi="Times New Roman"/>
+          <w:b w:val="0"/>
+          <w:sz w:val="24"/>
+        </w:rPr>
+        <w:t>RQ3: How accurately does the cognitive interrupt mechanism distinguish relevant dysfunctional sleep beliefs from non-triggering messages, and how reliably does it restore the behavioral state and associated context after an interrupt?</w:t>
+      </w:r>
+    </w:p>
+    <w:p>
+      <w:pPr>
+        <w:widowControl/>
+        <w:spacing w:line="360" w:lineRule="auto" w:before="0" w:after="240"/>
+        <w:ind w:left="0" w:right="0" w:firstLine="0"/>
+        <w:jc w:val="both"/>
+      </w:pPr>
+      <w:r>
+        <w:rPr>
+          <w:rFonts w:ascii="Times New Roman" w:hAnsi="Times New Roman"/>
+          <w:b w:val="0"/>
+          <w:sz w:val="24"/>
+        </w:rPr>
+        <w:t>RQ4: How do peer participants assess the usability of the prototype interface after completing scripted interactions, and what usability issues are identified for subsequent refinement?</w:t>
+      </w:r>
+    </w:p>
+    <w:p>
+      <w:pPr>
+        <w:widowControl/>
+        <w:spacing w:line="360" w:lineRule="auto" w:before="0" w:after="240"/>
+        <w:ind w:left="0" w:right="0" w:firstLine="0"/>
+        <w:jc w:val="both"/>
+      </w:pPr>
+      <w:r>
+        <w:rPr>
+          <w:rFonts w:ascii="Times New Roman" w:hAnsi="Times New Roman"/>
+          <w:b w:val="0"/>
+          <w:sz w:val="24"/>
+        </w:rPr>
+        <w:t>RQ1 maps to FSM transition accuracy, RQ2 to calculation agreement and retrieval-isolation checks, and RQ3 to interrupt precision, recall, and contextual recoverability. RQ4 provides supplementary interface evidence through SUS responses and participant feedback. None of these questions measures the treatment effectiveness of the prototype.</w:t>
+      </w:r>
+    </w:p>
+    <w:p>
+      <w:pPr>
+        <w:keepNext/>
+        <w:widowControl/>
+        <w:spacing w:line="360" w:lineRule="auto" w:before="360" w:after="360"/>
+        <w:ind w:left="0" w:right="0" w:firstLine="0"/>
+        <w:jc w:val="left"/>
+        <w:outlineLvl w:val="1"/>
+      </w:pPr>
+      <w:bookmarkStart w:id="1005" w:name="Ch1_1_5"/>
+      <w:r>
+        <w:rPr>
+          <w:rFonts w:ascii="Times New Roman" w:hAnsi="Times New Roman"/>
+          <w:b/>
+          <w:sz w:val="24"/>
+        </w:rPr>
+        <w:t>1.5 Scope and Limitations</w:t>
+      </w:r>
+      <w:bookmarkEnd w:id="1005"/>
+    </w:p>
+    <w:p>
+      <w:pPr>
+        <w:widowControl/>
+        <w:spacing w:line="360" w:lineRule="auto" w:before="0" w:after="240"/>
+        <w:ind w:left="0" w:right="0" w:firstLine="0"/>
+        <w:jc w:val="both"/>
+      </w:pPr>
+      <w:r>
+        <w:rPr>
+          <w:rFonts w:ascii="Times New Roman" w:hAnsi="Times New Roman"/>
+          <w:b w:val="0"/>
+          <w:sz w:val="24"/>
+        </w:rPr>
+        <w:t>The project covers the design, implementation, and evaluation of a research prototype based on the architecture described in the FYP1 proposal. Its behavioral workflow contains four macro-states: baseline assessment, sleep restriction, stimulus control, and relapse prevention. These states represent the prototype's orchestration design. Their sequencing is not presented as a universal clinical schedule for all CBT-I programs. The implementation focuses on sleep diary management, rule-based sleep restriction guidance, and cognitive restructuring support within that workflow.</w:t>
+      </w:r>
+    </w:p>
+    <w:p>
+      <w:pPr>
+        <w:widowControl/>
+        <w:spacing w:line="360" w:lineRule="auto" w:before="0" w:after="240"/>
+        <w:ind w:left="0" w:right="0" w:firstLine="0"/>
+        <w:jc w:val="both"/>
+      </w:pPr>
+      <w:r>
+        <w:rPr>
+          <w:rFonts w:ascii="Times New Roman" w:hAnsi="Times New Roman"/>
+          <w:b w:val="0"/>
+          <w:sz w:val="24"/>
+        </w:rPr>
+        <w:t>The technical scope includes a Python development environment, LangGraph orchestration, an open-source LLM, and a vector retrieval component such as FAISS. A behavioral protocol knowledge base and a cognitive intervention knowledge base provide separate content sources. The system also includes a deterministic calculator and checkpoint-based state persistence. Model selection, retrieval configuration, calculation rules, and transition conditions must be documented in the methodology so that the evaluation can be reproduced. No particular model or database configuration is claimed to have been implemented at this stage.</w:t>
+      </w:r>
+    </w:p>
+    <w:p>
+      <w:pPr>
+        <w:widowControl/>
+        <w:spacing w:line="360" w:lineRule="auto" w:before="0" w:after="240"/>
+        <w:ind w:left="0" w:right="0" w:firstLine="0"/>
+        <w:jc w:val="both"/>
+      </w:pPr>
+      <w:r>
+        <w:rPr>
+          <w:rFonts w:ascii="Times New Roman" w:hAnsi="Times New Roman"/>
+          <w:b w:val="0"/>
+          <w:sz w:val="24"/>
+        </w:rPr>
+        <w:t>Evaluation follows the six scenario categories proposed in FYP1: workflow progression, workflow deviation, contradictory input, interrupt triggering, false-positive suppression, and post-interrupt recovery. Scripted dialogues exercise expected behaviors and selected failure cases. A baseline comparison retains the same model, knowledge content, and prompt assets while removing FSM routing. Additional checks examine retrieval boundaries and component integration. The supplementary peer study evaluates interaction with the interface; participants are not recruited to receive treatment or demonstrate symptom improvement.</w:t>
+      </w:r>
+    </w:p>
+    <w:p>
+      <w:pPr>
+        <w:widowControl/>
+        <w:spacing w:line="360" w:lineRule="auto" w:before="0" w:after="240"/>
+        <w:ind w:left="0" w:right="0" w:firstLine="0"/>
+        <w:jc w:val="both"/>
+      </w:pPr>
+      <w:r>
+        <w:rPr>
+          <w:rFonts w:ascii="Times New Roman" w:hAnsi="Times New Roman"/>
+          <w:b w:val="0"/>
+          <w:sz w:val="24"/>
+        </w:rPr>
+        <w:t>The study does not include clinical diagnosis, medication management, emergency care, or deployment as a replacement for professional services. It does not measure remission, changes in insomnia severity, or other patient treatment outcomes. Any sleep-window output remains a research-prototype output and requires an appropriately reviewed protocol before clinical use. The local-model deployment proposed in FYP1 is a design intention; privacy depends on the actual inference, storage, logging, and networking configuration and cannot be inferred solely from the use of an open-source model.</w:t>
+      </w:r>
+    </w:p>
+    <w:p>
+      <w:pPr>
+        <w:widowControl/>
+        <w:spacing w:line="360" w:lineRule="auto" w:before="0" w:after="240"/>
+        <w:ind w:left="0" w:right="0" w:firstLine="0"/>
+        <w:jc w:val="both"/>
+      </w:pPr>
+      <w:r>
+        <w:rPr>
+          <w:rFonts w:ascii="Times New Roman" w:hAnsi="Times New Roman"/>
+          <w:b w:val="0"/>
+          <w:sz w:val="24"/>
+        </w:rPr>
+        <w:t>The evaluation is limited by the number and diversity of scripted cases, the correctness of reference labels, and the coverage of the selected knowledge sources. Good performance on the test suite would not guarantee equivalent performance on unrestricted real-world conversations. Interrupt decisions can also depend on interpretation of a message, so ambiguous cases require documented labeling rules. The small convenience sample used for usability assessment limits the generalizability of interface findings. These limitations will be considered when interpreting results and recommending further development.</w:t>
+      </w:r>
+    </w:p>
+    <w:p>
+      <w:pPr>
+        <w:keepNext/>
+        <w:widowControl/>
+        <w:spacing w:line="360" w:lineRule="auto" w:before="360" w:after="360"/>
+        <w:ind w:left="0" w:right="0" w:firstLine="0"/>
+        <w:jc w:val="left"/>
+        <w:outlineLvl w:val="1"/>
+      </w:pPr>
+      <w:bookmarkStart w:id="1006" w:name="Ch1_1_6"/>
+      <w:r>
+        <w:rPr>
+          <w:rFonts w:ascii="Times New Roman" w:hAnsi="Times New Roman"/>
+          <w:b/>
+          <w:sz w:val="24"/>
+        </w:rPr>
+        <w:t>1.6 Significance and Expected Contributions</w:t>
+      </w:r>
+      <w:bookmarkEnd w:id="1006"/>
+    </w:p>
+    <w:p>
+      <w:pPr>
+        <w:widowControl/>
+        <w:spacing w:line="360" w:lineRule="auto" w:before="0" w:after="240"/>
+        <w:ind w:left="0" w:right="0" w:firstLine="0"/>
+        <w:jc w:val="both"/>
+      </w:pPr>
+      <w:r>
+        <w:rPr>
+          <w:rFonts w:ascii="Times New Roman" w:hAnsi="Times New Roman"/>
+          <w:b w:val="0"/>
+          <w:sz w:val="24"/>
+        </w:rPr>
+        <w:t>The expected software-engineering contribution is an inspectable separation of responsibilities within a conversational system. The FSM determines permitted workflow actions, the calculator supplies numerical outputs, retrieval provides task-relevant source material, and the LLM generates the conversational response. This separation is intended to make failures easier to locate and to reduce dependence on a single generated response for both dialogue and process control. Whether it delivers the intended benefit remains an empirical question for the evaluation.</w:t>
+      </w:r>
+    </w:p>
+    <w:p>
+      <w:pPr>
+        <w:widowControl/>
+        <w:spacing w:line="360" w:lineRule="auto" w:before="0" w:after="240"/>
+        <w:ind w:left="0" w:right="0" w:firstLine="0"/>
+        <w:jc w:val="both"/>
+      </w:pPr>
+      <w:r>
+        <w:rPr>
+          <w:rFonts w:ascii="Times New Roman" w:hAnsi="Times New Roman"/>
+          <w:b w:val="0"/>
+          <w:sz w:val="24"/>
+        </w:rPr>
+        <w:t>A second expected contribution is a design for cognitive interruption without discarding behavioral progress. Checkpointed state and separate retrieval routes provide a concrete mechanism for suspending a task, addressing a relevant belief, and resuming the task with its data intact. Evaluating both triggering and recovery is important because a useful cognitive response alone would not demonstrate that the overall workflow remains consistent.</w:t>
+      </w:r>
+    </w:p>
+    <w:p>
+      <w:pPr>
+        <w:widowControl/>
+        <w:spacing w:line="360" w:lineRule="auto" w:before="0" w:after="240"/>
+        <w:ind w:left="0" w:right="0" w:firstLine="0"/>
+        <w:jc w:val="both"/>
+      </w:pPr>
+      <w:r>
+        <w:rPr>
+          <w:rFonts w:ascii="Times New Roman" w:hAnsi="Times New Roman"/>
+          <w:b w:val="0"/>
+          <w:sz w:val="24"/>
+        </w:rPr>
+        <w:t>A third expected contribution is a reproducible evaluation package linking architectural components to explicit scenarios, reference outputs, and quantitative measures. The controlled baseline comparison is intended to clarify the effect of FSM routing within the selected configuration. Retrieval-isolation checks and failure analysis complement aggregate scores by identifying circumstances in which the architecture does not behave as intended. This evidence can inform later revisions of the prototype and further investigation of structured conversational applications.</w:t>
+      </w:r>
+    </w:p>
+    <w:p>
+      <w:pPr>
+        <w:widowControl/>
+        <w:spacing w:line="360" w:lineRule="auto" w:before="0" w:after="240"/>
+        <w:ind w:left="0" w:right="0" w:firstLine="0"/>
+        <w:jc w:val="both"/>
+      </w:pPr>
+      <w:r>
+        <w:rPr>
+          <w:rFonts w:ascii="Times New Roman" w:hAnsi="Times New Roman"/>
+          <w:b w:val="0"/>
+          <w:sz w:val="24"/>
+        </w:rPr>
+        <w:t>The practical deliverables are the prototype, its behavioral and cognitive knowledge resources, documented calculation and transition rules, scenario scripts, and an evaluation report. Preliminary usability findings may guide improvements to the interface. Potential relevance to other structured support workflows is a direction for future investigation, rather than a demonstrated property of this study. The project makes no advance claim of improved clinical outcomes or reduced treatment dropout.</w:t>
+      </w:r>
+    </w:p>
+    <w:p>
+      <w:pPr>
+        <w:keepNext/>
+        <w:widowControl/>
+        <w:spacing w:line="360" w:lineRule="auto" w:before="360" w:after="360"/>
+        <w:ind w:left="0" w:right="0" w:firstLine="0"/>
+        <w:jc w:val="left"/>
+        <w:outlineLvl w:val="1"/>
+      </w:pPr>
+      <w:bookmarkStart w:id="1007" w:name="Ch1_1_7"/>
+      <w:r>
+        <w:rPr>
+          <w:rFonts w:ascii="Times New Roman" w:hAnsi="Times New Roman"/>
+          <w:b/>
+          <w:sz w:val="24"/>
+        </w:rPr>
+        <w:t>1.7 Overview of the Research Approach</w:t>
+      </w:r>
+      <w:bookmarkEnd w:id="1007"/>
+    </w:p>
+    <w:p>
+      <w:pPr>
+        <w:widowControl/>
+        <w:spacing w:line="360" w:lineRule="auto" w:before="0" w:after="240"/>
+        <w:ind w:left="0" w:right="0" w:firstLine="0"/>
+        <w:jc w:val="both"/>
+      </w:pPr>
+      <w:r>
+        <w:rPr>
+          <w:rFonts w:ascii="Times New Roman" w:hAnsi="Times New Roman"/>
+          <w:b w:val="0"/>
+          <w:sz w:val="24"/>
+        </w:rPr>
+        <w:t>The project adopts the Design Science Research approach described in FYP1, with iterative development organized through an Agile software development life cycle. The artifact is the hybrid RAG-FSM prototype. Requirements are derived from the selected CBT-I materials, the architectural concerns identified above, and the behaviors that the proposal intends to evaluate. Development proceeds through requirements analysis, architectural design, implementation, testing and refinement, and evaluation.</w:t>
+      </w:r>
+    </w:p>
+    <w:p>
+      <w:pPr>
+        <w:widowControl/>
+        <w:spacing w:line="360" w:lineRule="auto" w:before="0" w:after="240"/>
+        <w:ind w:left="0" w:right="0" w:firstLine="0"/>
+        <w:jc w:val="both"/>
+      </w:pPr>
+      <w:r>
+        <w:rPr>
+          <w:rFonts w:ascii="Times New Roman" w:hAnsi="Times New Roman"/>
+          <w:b w:val="0"/>
+          <w:sz w:val="24"/>
+        </w:rPr>
+        <w:t>Before formal evaluation, expected transitions, calculation outputs, retrieval boundaries, and interrupt labels will be specified for the test cases. Integration testing will examine data movement between the diary, calculator, FSM, retrieval pipelines, and dialogue generator. Scenario-based evaluation will then compare the integrated architecture with the linear baseline under documented, comparable conditions. Quantitative results will be interpreted together with failed cases and the limitations of the test set. Any variability arising from model generation must be recorded when designing and reporting the comparison.</w:t>
+      </w:r>
+    </w:p>
+    <w:p>
+      <w:pPr>
+        <w:widowControl/>
+        <w:spacing w:line="360" w:lineRule="auto" w:before="0" w:after="240"/>
+        <w:ind w:left="0" w:right="0" w:firstLine="0"/>
+        <w:jc w:val="both"/>
+      </w:pPr>
+      <w:r>
+        <w:rPr>
+          <w:rFonts w:ascii="Times New Roman" w:hAnsi="Times New Roman"/>
+          <w:b w:val="0"/>
+          <w:sz w:val="24"/>
+        </w:rPr>
+        <w:t>Usability assessment will supplement the architectural evaluation after the prototype can complete the scripted tasks. Participation should be voluntary and based on informed consent, with the research purpose and prototype limitations explained beforehand. Scripted or synthetic sleep information should be used wherever possible to avoid collecting unnecessary health information. The study should follow applicable institutional requirements before involving participants. Detailed procedures, instrumentation, and analysis methods will be specified in Chapter 3.</w:t>
+      </w:r>
+    </w:p>
+    <w:p>
+      <w:pPr>
+        <w:keepNext/>
+        <w:widowControl/>
+        <w:spacing w:line="360" w:lineRule="auto" w:before="360" w:after="360"/>
+        <w:ind w:left="0" w:right="0" w:firstLine="0"/>
+        <w:jc w:val="left"/>
+        <w:outlineLvl w:val="1"/>
+      </w:pPr>
+      <w:bookmarkStart w:id="1008" w:name="Ch1_1_8"/>
+      <w:r>
+        <w:rPr>
+          <w:rFonts w:ascii="Times New Roman" w:hAnsi="Times New Roman"/>
+          <w:b/>
+          <w:sz w:val="24"/>
+        </w:rPr>
+        <w:t>1.8 Thesis Content</w:t>
+      </w:r>
+      <w:bookmarkEnd w:id="1008"/>
+    </w:p>
+    <w:p>
+      <w:pPr>
+        <w:widowControl/>
+        <w:spacing w:line="360" w:lineRule="auto" w:before="0" w:after="240"/>
+        <w:ind w:left="0" w:right="0" w:firstLine="0"/>
+        <w:jc w:val="both"/>
+      </w:pPr>
+      <w:r>
+        <w:rPr>
+          <w:rFonts w:ascii="Times New Roman" w:hAnsi="Times New Roman"/>
+          <w:b w:val="0"/>
+          <w:sz w:val="24"/>
+        </w:rPr>
+        <w:t>The thesis follows the five-chapter organization provided by the supplied template. Chapter 1 introduces the background, problem statement, aim, objectives, research questions, scope, expected contributions, and research approach. It establishes the boundaries within which the prototype and its evaluation will be interpreted.</w:t>
+      </w:r>
+    </w:p>
+    <w:p>
+      <w:pPr>
+        <w:widowControl/>
+        <w:spacing w:line="360" w:lineRule="auto" w:before="0" w:after="240"/>
+        <w:ind w:left="0" w:right="0" w:firstLine="0"/>
+        <w:jc w:val="both"/>
+      </w:pPr>
+      <w:r>
+        <w:rPr>
+          <w:rFonts w:ascii="Times New Roman" w:hAnsi="Times New Roman"/>
+          <w:b w:val="0"/>
+          <w:sz w:val="24"/>
+        </w:rPr>
+        <w:t>Chapter 2 reviews the relevant literature on CBT-I and digital delivery, conversational systems, LLMs, retrieval-augmented generation, and FSM-based workflow control. It compares relevant approaches and develops the rationale for the proposed integration. Chapter 3 describes the research methodology, system design, implementation approach, knowledge-source preparation, calculation rules, scenario construction, baseline configuration, and usability procedures.</w:t>
+      </w:r>
+    </w:p>
+    <w:p>
+      <w:pPr>
+        <w:widowControl/>
+        <w:spacing w:line="360" w:lineRule="auto" w:before="0" w:after="240"/>
+        <w:ind w:left="0" w:right="0" w:firstLine="0"/>
+        <w:jc w:val="both"/>
+      </w:pPr>
+      <w:r>
+        <w:rPr>
+          <w:rFonts w:ascii="Times New Roman" w:hAnsi="Times New Roman"/>
+          <w:b w:val="0"/>
+          <w:sz w:val="24"/>
+        </w:rPr>
+        <w:t>Chapter 4 presents and discusses the implementation and evaluation results against the objectives and research questions. It includes architectural performance, baseline comparisons, observed failure cases, and supplementary usability findings. Chapter 5 summarizes the supported conclusions, limitations, and recommendations for future work. A consolidated reference list follows the chapters, and appendices provide supporting materials such as scenario definitions, evaluation instruments, and additional implementation details.</w:t>
+      </w:r>
+    </w:p>
+    <w:p>
+      <w:pPr>
+        <w:keepNext w:val="0"/>
+        <w:spacing w:afterLines="150" w:after="0" w:line="240" w:lineRule="auto" w:before="0"/>
         <w:jc w:val="center"/>
         <w:rPr>
           <w:rFonts w:ascii="Times New Roman" w:hAnsi="Times New Roman"/>
@@ -7896,6 +7226,7 @@
           <w:sz w:val="24"/>
         </w:rPr>
       </w:pPr>
+      <w:bookmarkStart w:id="1010" w:name="Chapter2"/>
       <w:r>
         <w:rPr>
           <w:rFonts w:ascii="Times New Roman" w:hAnsi="Times New Roman"/>
@@ -7905,6 +7236,7 @@
         <w:lastRenderedPageBreak/>
         <w:t>CHAPTER 2</w:t>
       </w:r>
+      <w:bookmarkEnd w:id="1010"/>
     </w:p>
     <w:p>
       <w:pPr>
@@ -9466,6 +8798,7 @@
           <w:sz w:val="24"/>
         </w:rPr>
       </w:pPr>
+      <w:bookmarkStart w:id="1011" w:name="Chapter3"/>
       <w:r>
         <w:rPr>
           <w:rFonts w:ascii="Times New Roman" w:hAnsi="Times New Roman"/>
@@ -9475,6 +8808,7 @@
         <w:lastRenderedPageBreak/>
         <w:t>CHAPTER 3</w:t>
       </w:r>
+      <w:bookmarkEnd w:id="1011"/>
     </w:p>
     <w:p>
       <w:pPr>
@@ -9887,6 +9221,7 @@
           <w:sz w:val="24"/>
         </w:rPr>
       </w:pPr>
+      <w:bookmarkStart w:id="1012" w:name="Chapter4"/>
       <w:r>
         <w:rPr>
           <w:rFonts w:ascii="Times New Roman" w:hAnsi="Times New Roman"/>
@@ -9896,6 +9231,7 @@
         <w:lastRenderedPageBreak/>
         <w:t>CHAPTER 4</w:t>
       </w:r>
+      <w:bookmarkEnd w:id="1012"/>
     </w:p>
     <w:p>
       <w:pPr>
@@ -10341,6 +9677,7 @@
           <w:sz w:val="24"/>
         </w:rPr>
       </w:pPr>
+      <w:bookmarkStart w:id="1013" w:name="Chapter5"/>
       <w:r>
         <w:rPr>
           <w:rFonts w:ascii="Times New Roman" w:hAnsi="Times New Roman"/>
@@ -10350,6 +9687,7 @@
         <w:lastRenderedPageBreak/>
         <w:t>CHAPTER 5</w:t>
       </w:r>
+      <w:bookmarkEnd w:id="1013"/>
     </w:p>
     <w:p>
       <w:pPr>
@@ -10718,6 +10056,7 @@
     <w:p>
       <w:pPr>
         <w:pStyle w:val="Default"/>
+        <w:pageBreakBefore/>
         <w:spacing w:line="360" w:lineRule="auto"/>
         <w:jc w:val="center"/>
         <w:rPr>
@@ -10727,6 +10066,7 @@
           <w:szCs w:val="23"/>
         </w:rPr>
       </w:pPr>
+      <w:bookmarkStart w:id="1014" w:name="References"/>
       <w:r>
         <w:rPr>
           <w:b/>
@@ -10737,378 +10077,505 @@
         <w:lastRenderedPageBreak/>
         <w:t>REFERENCES</w:t>
       </w:r>
-    </w:p>
-    <w:p>
-      <w:pPr>
-        <w:pStyle w:val="Default"/>
-        <w:spacing w:line="360" w:lineRule="auto"/>
-        <w:rPr>
-          <w:sz w:val="23"/>
-          <w:szCs w:val="23"/>
-        </w:rPr>
-      </w:pPr>
-    </w:p>
-    <w:p>
-      <w:pPr>
-        <w:pStyle w:val="Default"/>
-        <w:tabs>
-          <w:tab w:val="left" w:pos="720"/>
-        </w:tabs>
-        <w:ind w:left="720" w:hanging="720"/>
-        <w:rPr>
-          <w:sz w:val="23"/>
-          <w:szCs w:val="23"/>
-        </w:rPr>
-      </w:pPr>
-      <w:proofErr w:type="spellStart"/>
-      <w:r>
-        <w:rPr>
-          <w:sz w:val="23"/>
-          <w:szCs w:val="23"/>
-        </w:rPr>
-        <w:t>Barrance</w:t>
-      </w:r>
-      <w:proofErr w:type="spellEnd"/>
-      <w:r>
-        <w:rPr>
-          <w:sz w:val="23"/>
-          <w:szCs w:val="23"/>
-        </w:rPr>
-        <w:t xml:space="preserve">, T. (2022, February 7). </w:t>
-      </w:r>
-      <w:r>
-        <w:rPr>
+      <w:bookmarkEnd w:id="1014"/>
+    </w:p>
+    <w:p>
+      <w:pPr>
+        <w:keepLines/>
+        <w:widowControl/>
+        <w:spacing w:line="240" w:lineRule="auto" w:before="0" w:after="240"/>
+        <w:ind w:left="720" w:right="0" w:hanging="720"/>
+        <w:jc w:val="left"/>
+      </w:pPr>
+      <w:r>
+        <w:rPr>
+          <w:rFonts w:ascii="Times New Roman" w:hAnsi="Times New Roman"/>
+          <w:b w:val="0"/>
+          <w:sz w:val="24"/>
+        </w:rPr>
+        <w:t xml:space="preserve">Bao, X., Zhu, X., Yang, D., Lou, H., Wang, R., Wu, Y., Li, W., Xia, Y., Zeng, L., Pan, Y., Wang, X., Zhang, X., Ling, C., Ling, Y., Zhang, Y., Zhao, Q., &amp; Yang, M. (2025). eCBT-I dialogue system: A comparative evaluation of large language models and adaptation strategies for insomnia treatment. </w:t>
+      </w:r>
+      <w:r>
+        <w:rPr>
+          <w:rFonts w:ascii="Times New Roman" w:hAnsi="Times New Roman"/>
+          <w:b w:val="0"/>
           <w:i/>
-          <w:iCs/>
-          <w:sz w:val="23"/>
-          <w:szCs w:val="23"/>
-        </w:rPr>
-        <w:t>Continuity: Shoot and Edit so your Movie Makes Sense</w:t>
-      </w:r>
-      <w:r>
-        <w:rPr>
-          <w:sz w:val="23"/>
-          <w:szCs w:val="23"/>
-        </w:rPr>
-        <w:t xml:space="preserve">. Learn About Film. </w:t>
-      </w:r>
-      <w:hyperlink r:id="rId13" w:history="1">
-        <w:r>
-          <w:rPr>
-            <w:rStyle w:val="Hyperlink"/>
-            <w:sz w:val="23"/>
-            <w:szCs w:val="23"/>
-          </w:rPr>
-          <w:t>https://www.learnaboutfilm.com/film-language/sequence/</w:t>
-        </w:r>
-      </w:hyperlink>
-      <w:r>
-        <w:rPr>
-          <w:sz w:val="23"/>
-          <w:szCs w:val="23"/>
-        </w:rPr>
-        <w:t xml:space="preserve"> </w:t>
-      </w:r>
-    </w:p>
-    <w:p>
-      <w:pPr>
-        <w:pStyle w:val="Default"/>
-        <w:spacing w:line="360" w:lineRule="auto"/>
-        <w:rPr>
-          <w:sz w:val="23"/>
-          <w:szCs w:val="23"/>
-        </w:rPr>
-      </w:pPr>
-    </w:p>
-    <w:p>
-      <w:pPr>
-        <w:ind w:left="720" w:hanging="720"/>
-        <w:rPr>
-          <w:rFonts w:ascii="Arial Narrow" w:hAnsi="Arial Narrow"/>
-        </w:rPr>
-      </w:pPr>
-      <w:r>
-        <w:rPr>
-          <w:sz w:val="23"/>
-          <w:szCs w:val="23"/>
-        </w:rPr>
-        <w:t xml:space="preserve">Bordwell, D., &amp; Thompson, K. (2000). </w:t>
-      </w:r>
-      <w:r>
-        <w:rPr>
+          <w:sz w:val="24"/>
+        </w:rPr>
+        <w:t>Journal of Translational Medicine, 23</w:t>
+      </w:r>
+      <w:r>
+        <w:rPr>
+          <w:rFonts w:ascii="Times New Roman" w:hAnsi="Times New Roman"/>
+          <w:b w:val="0"/>
+          <w:sz w:val="24"/>
+        </w:rPr>
+        <w:t>(1), Article 862. https://doi.org/10.1186/s12967-025-06871-y</w:t>
+      </w:r>
+    </w:p>
+    <w:p>
+      <w:pPr>
+        <w:keepLines/>
+        <w:widowControl/>
+        <w:spacing w:line="240" w:lineRule="auto" w:before="0" w:after="240"/>
+        <w:ind w:left="720" w:right="0" w:hanging="720"/>
+        <w:jc w:val="left"/>
+      </w:pPr>
+      <w:r>
+        <w:rPr>
+          <w:rFonts w:ascii="Times New Roman" w:hAnsi="Times New Roman"/>
+          <w:b w:val="0"/>
+          <w:sz w:val="24"/>
+        </w:rPr>
+        <w:t xml:space="preserve">Epstein, D. R., Sidani, S., Bootzin, R. R., &amp; Belyea, M. J. (2012). Dismantling multicomponent behavioral treatment for insomnia in older adults: A randomized controlled trial. </w:t>
+      </w:r>
+      <w:r>
+        <w:rPr>
+          <w:rFonts w:ascii="Times New Roman" w:hAnsi="Times New Roman"/>
+          <w:b w:val="0"/>
           <w:i/>
-          <w:iCs/>
-          <w:sz w:val="23"/>
-          <w:szCs w:val="23"/>
-        </w:rPr>
-        <w:t xml:space="preserve">Film Art: An Introduction (Sixth Edition) </w:t>
-      </w:r>
-      <w:r>
-        <w:rPr>
-          <w:sz w:val="23"/>
-          <w:szCs w:val="23"/>
-        </w:rPr>
-        <w:t>(6th ed.). McGraw-Hill Education - Europe.</w:t>
-      </w:r>
-    </w:p>
-    <w:p>
-      <w:pPr>
-        <w:rPr>
-          <w:rFonts w:ascii="Arial Narrow" w:hAnsi="Arial Narrow"/>
-        </w:rPr>
-      </w:pPr>
-    </w:p>
-    <w:p>
-      <w:pPr>
-        <w:rPr>
-          <w:rFonts w:ascii="Arial Narrow" w:hAnsi="Arial Narrow"/>
-        </w:rPr>
-      </w:pPr>
-    </w:p>
-    <w:p>
-      <w:pPr>
-        <w:rPr>
-          <w:rFonts w:ascii="Arial Narrow" w:hAnsi="Arial Narrow"/>
-        </w:rPr>
-      </w:pPr>
-    </w:p>
-    <w:p>
-      <w:pPr>
-        <w:rPr>
-          <w:rFonts w:ascii="Arial Narrow" w:hAnsi="Arial Narrow"/>
-        </w:rPr>
-      </w:pPr>
-    </w:p>
-    <w:p>
-      <w:pPr>
-        <w:rPr>
-          <w:rFonts w:ascii="Arial Narrow" w:hAnsi="Arial Narrow"/>
-        </w:rPr>
-      </w:pPr>
-    </w:p>
-    <w:p>
-      <w:pPr>
-        <w:rPr>
-          <w:rFonts w:ascii="Arial Narrow" w:hAnsi="Arial Narrow"/>
-        </w:rPr>
-      </w:pPr>
-    </w:p>
-    <w:p>
-      <w:pPr>
-        <w:rPr>
-          <w:rFonts w:ascii="Arial Narrow" w:hAnsi="Arial Narrow"/>
-        </w:rPr>
-      </w:pPr>
-    </w:p>
-    <w:p>
-      <w:pPr>
-        <w:rPr>
-          <w:rFonts w:ascii="Arial Narrow" w:hAnsi="Arial Narrow"/>
-        </w:rPr>
-      </w:pPr>
-    </w:p>
-    <w:p>
-      <w:pPr>
-        <w:rPr>
-          <w:rFonts w:ascii="Arial Narrow" w:hAnsi="Arial Narrow"/>
-        </w:rPr>
-      </w:pPr>
-    </w:p>
-    <w:p>
-      <w:pPr>
-        <w:rPr>
-          <w:rFonts w:ascii="Arial Narrow" w:hAnsi="Arial Narrow"/>
-        </w:rPr>
-      </w:pPr>
-    </w:p>
-    <w:p>
-      <w:pPr>
-        <w:rPr>
-          <w:rFonts w:ascii="Arial Narrow" w:hAnsi="Arial Narrow"/>
-        </w:rPr>
-      </w:pPr>
-    </w:p>
-    <w:p>
-      <w:pPr>
-        <w:rPr>
-          <w:rFonts w:ascii="Arial Narrow" w:hAnsi="Arial Narrow"/>
-        </w:rPr>
-      </w:pPr>
-    </w:p>
-    <w:p>
-      <w:pPr>
-        <w:rPr>
-          <w:rFonts w:ascii="Arial Narrow" w:hAnsi="Arial Narrow"/>
-        </w:rPr>
-      </w:pPr>
-    </w:p>
-    <w:p>
-      <w:pPr>
-        <w:rPr>
-          <w:rFonts w:ascii="Arial Narrow" w:hAnsi="Arial Narrow"/>
-        </w:rPr>
-      </w:pPr>
-    </w:p>
-    <w:p>
-      <w:pPr>
-        <w:rPr>
-          <w:rFonts w:ascii="Arial Narrow" w:hAnsi="Arial Narrow"/>
-        </w:rPr>
-      </w:pPr>
-    </w:p>
-    <w:p>
-      <w:pPr>
-        <w:rPr>
-          <w:rFonts w:ascii="Arial Narrow" w:hAnsi="Arial Narrow"/>
-        </w:rPr>
-      </w:pPr>
-    </w:p>
-    <w:p>
-      <w:pPr>
-        <w:rPr>
-          <w:rFonts w:ascii="Arial Narrow" w:hAnsi="Arial Narrow"/>
-        </w:rPr>
-      </w:pPr>
-    </w:p>
-    <w:p>
-      <w:pPr>
-        <w:rPr>
-          <w:rFonts w:ascii="Arial Narrow" w:hAnsi="Arial Narrow"/>
-        </w:rPr>
-      </w:pPr>
-    </w:p>
-    <w:p>
-      <w:pPr>
-        <w:rPr>
-          <w:rFonts w:ascii="Arial Narrow" w:hAnsi="Arial Narrow"/>
-        </w:rPr>
-      </w:pPr>
-    </w:p>
-    <w:p>
-      <w:pPr>
-        <w:rPr>
-          <w:rFonts w:ascii="Arial Narrow" w:hAnsi="Arial Narrow"/>
-        </w:rPr>
-      </w:pPr>
-    </w:p>
-    <w:p>
-      <w:pPr>
-        <w:rPr>
-          <w:rFonts w:ascii="Arial Narrow" w:hAnsi="Arial Narrow"/>
-        </w:rPr>
-      </w:pPr>
-    </w:p>
-    <w:p>
-      <w:pPr>
-        <w:rPr>
-          <w:rFonts w:ascii="Arial Narrow" w:hAnsi="Arial Narrow"/>
-        </w:rPr>
-      </w:pPr>
-    </w:p>
-    <w:p>
-      <w:pPr>
-        <w:rPr>
-          <w:rFonts w:ascii="Arial Narrow" w:hAnsi="Arial Narrow"/>
-        </w:rPr>
-      </w:pPr>
-    </w:p>
-    <w:p>
-      <w:pPr>
-        <w:rPr>
-          <w:rFonts w:ascii="Arial Narrow" w:hAnsi="Arial Narrow"/>
-        </w:rPr>
-      </w:pPr>
-    </w:p>
-    <w:p>
-      <w:pPr>
-        <w:rPr>
-          <w:rFonts w:ascii="Arial Narrow" w:hAnsi="Arial Narrow"/>
-        </w:rPr>
-      </w:pPr>
-    </w:p>
-    <w:p>
-      <w:pPr>
-        <w:rPr>
-          <w:rFonts w:ascii="Arial Narrow" w:hAnsi="Arial Narrow"/>
-        </w:rPr>
-      </w:pPr>
-    </w:p>
-    <w:p>
-      <w:pPr>
-        <w:rPr>
-          <w:rFonts w:ascii="Arial Narrow" w:hAnsi="Arial Narrow"/>
-        </w:rPr>
-      </w:pPr>
-    </w:p>
-    <w:p>
-      <w:pPr>
-        <w:rPr>
-          <w:rFonts w:ascii="Arial Narrow" w:hAnsi="Arial Narrow"/>
-        </w:rPr>
-      </w:pPr>
-    </w:p>
-    <w:p>
-      <w:pPr>
-        <w:rPr>
-          <w:rFonts w:ascii="Arial Narrow" w:hAnsi="Arial Narrow"/>
-        </w:rPr>
-      </w:pPr>
-    </w:p>
-    <w:p>
-      <w:pPr>
-        <w:rPr>
-          <w:rFonts w:ascii="Arial Narrow" w:hAnsi="Arial Narrow"/>
-        </w:rPr>
-      </w:pPr>
-    </w:p>
-    <w:p>
-      <w:pPr>
-        <w:rPr>
-          <w:rFonts w:ascii="Arial Narrow" w:hAnsi="Arial Narrow"/>
-        </w:rPr>
-      </w:pPr>
-    </w:p>
-    <w:p>
-      <w:pPr>
-        <w:rPr>
-          <w:rFonts w:ascii="Arial Narrow" w:hAnsi="Arial Narrow"/>
-        </w:rPr>
-      </w:pPr>
-    </w:p>
-    <w:p>
-      <w:pPr>
-        <w:rPr>
-          <w:rFonts w:ascii="Arial Narrow" w:hAnsi="Arial Narrow"/>
-        </w:rPr>
-      </w:pPr>
-    </w:p>
-    <w:p>
-      <w:pPr>
-        <w:rPr>
-          <w:rFonts w:ascii="Arial Narrow" w:hAnsi="Arial Narrow"/>
-        </w:rPr>
-      </w:pPr>
-    </w:p>
-    <w:p>
-      <w:pPr>
-        <w:rPr>
-          <w:rFonts w:ascii="Arial Narrow" w:hAnsi="Arial Narrow"/>
-        </w:rPr>
-      </w:pPr>
-    </w:p>
-    <w:p>
-      <w:pPr>
-        <w:rPr>
-          <w:rFonts w:ascii="Arial Narrow" w:hAnsi="Arial Narrow"/>
-        </w:rPr>
-      </w:pPr>
-    </w:p>
-    <w:p>
-      <w:pPr>
-        <w:rPr>
-          <w:rFonts w:ascii="Arial Narrow" w:hAnsi="Arial Narrow"/>
-        </w:rPr>
-      </w:pPr>
+          <w:sz w:val="24"/>
+        </w:rPr>
+        <w:t>Sleep, 35</w:t>
+      </w:r>
+      <w:r>
+        <w:rPr>
+          <w:rFonts w:ascii="Times New Roman" w:hAnsi="Times New Roman"/>
+          <w:b w:val="0"/>
+          <w:sz w:val="24"/>
+        </w:rPr>
+        <w:t>(6), 797–805. https://doi.org/10.5665/sleep.1878</w:t>
+      </w:r>
+    </w:p>
+    <w:p>
+      <w:pPr>
+        <w:keepLines/>
+        <w:widowControl/>
+        <w:spacing w:line="240" w:lineRule="auto" w:before="0" w:after="240"/>
+        <w:ind w:left="720" w:right="0" w:hanging="720"/>
+        <w:jc w:val="left"/>
+      </w:pPr>
+      <w:r>
+        <w:rPr>
+          <w:rFonts w:ascii="Times New Roman" w:hAnsi="Times New Roman"/>
+          <w:b w:val="0"/>
+          <w:sz w:val="24"/>
+        </w:rPr>
+        <w:t xml:space="preserve">Espie, C. A., Kyle, S. D., Williams, C., Ong, J. C., Douglas, N. J., Hames, P., &amp; Brown, J. S. L. (2012). A randomized, placebo-controlled trial of online cognitive behavioral therapy for chronic insomnia disorder delivered via an automated media-rich web application. </w:t>
+      </w:r>
+      <w:r>
+        <w:rPr>
+          <w:rFonts w:ascii="Times New Roman" w:hAnsi="Times New Roman"/>
+          <w:b w:val="0"/>
+          <w:i/>
+          <w:sz w:val="24"/>
+        </w:rPr>
+        <w:t>Sleep, 35</w:t>
+      </w:r>
+      <w:r>
+        <w:rPr>
+          <w:rFonts w:ascii="Times New Roman" w:hAnsi="Times New Roman"/>
+          <w:b w:val="0"/>
+          <w:sz w:val="24"/>
+        </w:rPr>
+        <w:t>(6), 769–781. https://doi.org/10.5665/sleep.1872</w:t>
+      </w:r>
+    </w:p>
+    <w:p>
+      <w:pPr>
+        <w:keepLines/>
+        <w:widowControl/>
+        <w:spacing w:line="240" w:lineRule="auto" w:before="0" w:after="240"/>
+        <w:ind w:left="720" w:right="0" w:hanging="720"/>
+        <w:jc w:val="left"/>
+      </w:pPr>
+      <w:r>
+        <w:rPr>
+          <w:rFonts w:ascii="Times New Roman" w:hAnsi="Times New Roman"/>
+          <w:b w:val="0"/>
+          <w:sz w:val="24"/>
+        </w:rPr>
+        <w:t xml:space="preserve">Koffel, E., Kuhn, E., Petsoulis, N., Erbes, C. R., Anders, S., Hoffman, J. E., Ruzek, J. I., &amp; Polusny, M. A. (2018). A randomized controlled pilot study of CBT-I Coach: Feasibility, acceptability, and potential impact of a mobile phone application for patients in cognitive behavioral therapy for insomnia. </w:t>
+      </w:r>
+      <w:r>
+        <w:rPr>
+          <w:rFonts w:ascii="Times New Roman" w:hAnsi="Times New Roman"/>
+          <w:b w:val="0"/>
+          <w:i/>
+          <w:sz w:val="24"/>
+        </w:rPr>
+        <w:t>Health Informatics Journal, 24</w:t>
+      </w:r>
+      <w:r>
+        <w:rPr>
+          <w:rFonts w:ascii="Times New Roman" w:hAnsi="Times New Roman"/>
+          <w:b w:val="0"/>
+          <w:sz w:val="24"/>
+        </w:rPr>
+        <w:t>(1), 3–13. https://doi.org/10.1177/1460458216656472</w:t>
+      </w:r>
+    </w:p>
+    <w:p>
+      <w:pPr>
+        <w:keepLines/>
+        <w:widowControl/>
+        <w:spacing w:line="240" w:lineRule="auto" w:before="0" w:after="240"/>
+        <w:ind w:left="720" w:right="0" w:hanging="720"/>
+        <w:jc w:val="left"/>
+      </w:pPr>
+      <w:r>
+        <w:rPr>
+          <w:rFonts w:ascii="Times New Roman" w:hAnsi="Times New Roman"/>
+          <w:b w:val="0"/>
+          <w:sz w:val="24"/>
+        </w:rPr>
+        <w:t xml:space="preserve">Lewis, P., Perez, E., Piktus, A., Petroni, F., Karpukhin, V., Goyal, N., Küttler, H., Lewis, M., Yih, W., Rocktäschel, T., Riedel, S., &amp; Kiela, D. (2020). Retrieval-augmented generation for knowledge-intensive NLP tasks. </w:t>
+      </w:r>
+      <w:r>
+        <w:rPr>
+          <w:rFonts w:ascii="Times New Roman" w:hAnsi="Times New Roman"/>
+          <w:b w:val="0"/>
+          <w:i/>
+          <w:sz w:val="24"/>
+        </w:rPr>
+        <w:t>Advances in Neural Information Processing Systems, 33</w:t>
+      </w:r>
+      <w:r>
+        <w:rPr>
+          <w:rFonts w:ascii="Times New Roman" w:hAnsi="Times New Roman"/>
+          <w:b w:val="0"/>
+          <w:sz w:val="24"/>
+        </w:rPr>
+        <w:t>, 9459–9474. https://doi.org/10.48550/arXiv.2005.11401</w:t>
+      </w:r>
+    </w:p>
+    <w:p>
+      <w:pPr>
+        <w:keepLines/>
+        <w:widowControl/>
+        <w:spacing w:line="240" w:lineRule="auto" w:before="0" w:after="240"/>
+        <w:ind w:left="720" w:right="0" w:hanging="720"/>
+        <w:jc w:val="left"/>
+      </w:pPr>
+      <w:r>
+        <w:rPr>
+          <w:rFonts w:ascii="Times New Roman" w:hAnsi="Times New Roman"/>
+          <w:b w:val="0"/>
+          <w:sz w:val="24"/>
+        </w:rPr>
+        <w:t xml:space="preserve">Morin, C. M., Bootzin, R. R., Buysse, D. J., Edinger, J. D., Espie, C. A., &amp; Lichstein, K. L. (2006). Psychological and behavioral treatment of insomnia: Update of the recent evidence (1998–2004). </w:t>
+      </w:r>
+      <w:r>
+        <w:rPr>
+          <w:rFonts w:ascii="Times New Roman" w:hAnsi="Times New Roman"/>
+          <w:b w:val="0"/>
+          <w:i/>
+          <w:sz w:val="24"/>
+        </w:rPr>
+        <w:t>Sleep, 29</w:t>
+      </w:r>
+      <w:r>
+        <w:rPr>
+          <w:rFonts w:ascii="Times New Roman" w:hAnsi="Times New Roman"/>
+          <w:b w:val="0"/>
+          <w:sz w:val="24"/>
+        </w:rPr>
+        <w:t>(11), 1398–1414. https://doi.org/10.1093/sleep/29.11.1398</w:t>
+      </w:r>
+    </w:p>
+    <w:p>
+      <w:pPr>
+        <w:keepLines/>
+        <w:widowControl/>
+        <w:spacing w:line="240" w:lineRule="auto" w:before="0" w:after="240"/>
+        <w:ind w:left="720" w:right="0" w:hanging="720"/>
+        <w:jc w:val="left"/>
+      </w:pPr>
+      <w:r>
+        <w:rPr>
+          <w:rFonts w:ascii="Times New Roman" w:hAnsi="Times New Roman"/>
+          <w:b w:val="0"/>
+          <w:sz w:val="24"/>
+        </w:rPr>
+        <w:t xml:space="preserve">Ritterband, L. M., Thorndike, F. P., Ingersoll, K. S., Lord, H. R., Gonder-Frederick, L., Frederick, C., Quigg, M. S., Cohn, W. F., &amp; Morin, C. M. (2017). Effect of a web-based cognitive behavior therapy for insomnia intervention with 1-year follow-up: A randomized clinical trial. </w:t>
+      </w:r>
+      <w:r>
+        <w:rPr>
+          <w:rFonts w:ascii="Times New Roman" w:hAnsi="Times New Roman"/>
+          <w:b w:val="0"/>
+          <w:i/>
+          <w:sz w:val="24"/>
+        </w:rPr>
+        <w:t>JAMA Psychiatry, 74</w:t>
+      </w:r>
+      <w:r>
+        <w:rPr>
+          <w:rFonts w:ascii="Times New Roman" w:hAnsi="Times New Roman"/>
+          <w:b w:val="0"/>
+          <w:sz w:val="24"/>
+        </w:rPr>
+        <w:t>(1), 68–75. https://doi.org/10.1001/jamapsychiatry.2016.3249</w:t>
+      </w:r>
+    </w:p>
+    <w:p>
+      <w:pPr>
+        <w:rPr>
+          <w:rFonts w:ascii="Arial Narrow" w:hAnsi="Arial Narrow"/>
+        </w:rPr>
+      </w:pPr>
+    </w:p>
+    <w:p>
+      <w:pPr>
+        <w:rPr>
+          <w:rFonts w:ascii="Arial Narrow" w:hAnsi="Arial Narrow"/>
+        </w:rPr>
+      </w:pPr>
+    </w:p>
+    <w:p>
+      <w:pPr>
+        <w:rPr>
+          <w:rFonts w:ascii="Arial Narrow" w:hAnsi="Arial Narrow"/>
+        </w:rPr>
+      </w:pPr>
+    </w:p>
+    <w:p>
+      <w:pPr>
+        <w:rPr>
+          <w:rFonts w:ascii="Arial Narrow" w:hAnsi="Arial Narrow"/>
+        </w:rPr>
+      </w:pPr>
+    </w:p>
+    <w:p>
+      <w:pPr>
+        <w:rPr>
+          <w:rFonts w:ascii="Arial Narrow" w:hAnsi="Arial Narrow"/>
+        </w:rPr>
+      </w:pPr>
+    </w:p>
+    <w:p>
+      <w:pPr>
+        <w:rPr>
+          <w:rFonts w:ascii="Arial Narrow" w:hAnsi="Arial Narrow"/>
+        </w:rPr>
+      </w:pPr>
+    </w:p>
+    <w:p>
+      <w:pPr>
+        <w:rPr>
+          <w:rFonts w:ascii="Arial Narrow" w:hAnsi="Arial Narrow"/>
+        </w:rPr>
+      </w:pPr>
+    </w:p>
+    <w:p>
+      <w:pPr>
+        <w:rPr>
+          <w:rFonts w:ascii="Arial Narrow" w:hAnsi="Arial Narrow"/>
+        </w:rPr>
+      </w:pPr>
+    </w:p>
+    <w:p>
+      <w:pPr>
+        <w:rPr>
+          <w:rFonts w:ascii="Arial Narrow" w:hAnsi="Arial Narrow"/>
+        </w:rPr>
+      </w:pPr>
+    </w:p>
+    <w:p>
+      <w:pPr>
+        <w:rPr>
+          <w:rFonts w:ascii="Arial Narrow" w:hAnsi="Arial Narrow"/>
+        </w:rPr>
+      </w:pPr>
+    </w:p>
+    <w:p>
+      <w:pPr>
+        <w:rPr>
+          <w:rFonts w:ascii="Arial Narrow" w:hAnsi="Arial Narrow"/>
+        </w:rPr>
+      </w:pPr>
+    </w:p>
+    <w:p>
+      <w:pPr>
+        <w:rPr>
+          <w:rFonts w:ascii="Arial Narrow" w:hAnsi="Arial Narrow"/>
+        </w:rPr>
+      </w:pPr>
+    </w:p>
+    <w:p>
+      <w:pPr>
+        <w:rPr>
+          <w:rFonts w:ascii="Arial Narrow" w:hAnsi="Arial Narrow"/>
+        </w:rPr>
+      </w:pPr>
+    </w:p>
+    <w:p>
+      <w:pPr>
+        <w:rPr>
+          <w:rFonts w:ascii="Arial Narrow" w:hAnsi="Arial Narrow"/>
+        </w:rPr>
+      </w:pPr>
+    </w:p>
+    <w:p>
+      <w:pPr>
+        <w:rPr>
+          <w:rFonts w:ascii="Arial Narrow" w:hAnsi="Arial Narrow"/>
+        </w:rPr>
+      </w:pPr>
+    </w:p>
+    <w:p>
+      <w:pPr>
+        <w:rPr>
+          <w:rFonts w:ascii="Arial Narrow" w:hAnsi="Arial Narrow"/>
+        </w:rPr>
+      </w:pPr>
+    </w:p>
+    <w:p>
+      <w:pPr>
+        <w:rPr>
+          <w:rFonts w:ascii="Arial Narrow" w:hAnsi="Arial Narrow"/>
+        </w:rPr>
+      </w:pPr>
+    </w:p>
+    <w:p>
+      <w:pPr>
+        <w:rPr>
+          <w:rFonts w:ascii="Arial Narrow" w:hAnsi="Arial Narrow"/>
+        </w:rPr>
+      </w:pPr>
+    </w:p>
+    <w:p>
+      <w:pPr>
+        <w:rPr>
+          <w:rFonts w:ascii="Arial Narrow" w:hAnsi="Arial Narrow"/>
+        </w:rPr>
+      </w:pPr>
+    </w:p>
+    <w:p>
+      <w:pPr>
+        <w:rPr>
+          <w:rFonts w:ascii="Arial Narrow" w:hAnsi="Arial Narrow"/>
+        </w:rPr>
+      </w:pPr>
+    </w:p>
+    <w:p>
+      <w:pPr>
+        <w:rPr>
+          <w:rFonts w:ascii="Arial Narrow" w:hAnsi="Arial Narrow"/>
+        </w:rPr>
+      </w:pPr>
+    </w:p>
+    <w:p>
+      <w:pPr>
+        <w:rPr>
+          <w:rFonts w:ascii="Arial Narrow" w:hAnsi="Arial Narrow"/>
+        </w:rPr>
+      </w:pPr>
+    </w:p>
+    <w:p>
+      <w:pPr>
+        <w:rPr>
+          <w:rFonts w:ascii="Arial Narrow" w:hAnsi="Arial Narrow"/>
+        </w:rPr>
+      </w:pPr>
+    </w:p>
+    <w:p>
+      <w:pPr>
+        <w:rPr>
+          <w:rFonts w:ascii="Arial Narrow" w:hAnsi="Arial Narrow"/>
+        </w:rPr>
+      </w:pPr>
+    </w:p>
+    <w:p>
+      <w:pPr>
+        <w:rPr>
+          <w:rFonts w:ascii="Arial Narrow" w:hAnsi="Arial Narrow"/>
+        </w:rPr>
+      </w:pPr>
+    </w:p>
+    <w:p>
+      <w:pPr>
+        <w:rPr>
+          <w:rFonts w:ascii="Arial Narrow" w:hAnsi="Arial Narrow"/>
+        </w:rPr>
+      </w:pPr>
+    </w:p>
+    <w:p>
+      <w:pPr>
+        <w:rPr>
+          <w:rFonts w:ascii="Arial Narrow" w:hAnsi="Arial Narrow"/>
+        </w:rPr>
+      </w:pPr>
+    </w:p>
+    <w:p>
+      <w:pPr>
+        <w:rPr>
+          <w:rFonts w:ascii="Arial Narrow" w:hAnsi="Arial Narrow"/>
+        </w:rPr>
+      </w:pPr>
+    </w:p>
+    <w:p>
+      <w:pPr>
+        <w:rPr>
+          <w:rFonts w:ascii="Arial Narrow" w:hAnsi="Arial Narrow"/>
+        </w:rPr>
+      </w:pPr>
+    </w:p>
+    <w:p>
+      <w:pPr>
+        <w:rPr>
+          <w:rFonts w:ascii="Arial Narrow" w:hAnsi="Arial Narrow"/>
+        </w:rPr>
+      </w:pPr>
+    </w:p>
+    <w:p>
+      <w:pPr>
+        <w:rPr>
+          <w:rFonts w:ascii="Arial Narrow" w:hAnsi="Arial Narrow"/>
+        </w:rPr>
+      </w:pPr>
+    </w:p>
+    <w:p>
+      <w:pPr>
+        <w:rPr>
+          <w:rFonts w:ascii="Arial Narrow" w:hAnsi="Arial Narrow"/>
+        </w:rPr>
+      </w:pPr>
+    </w:p>
+    <w:p>
+      <w:pPr>
+        <w:rPr>
+          <w:rFonts w:ascii="Arial Narrow" w:hAnsi="Arial Narrow"/>
+        </w:rPr>
+      </w:pPr>
+    </w:p>
+    <w:p>
+      <w:pPr>
+        <w:rPr>
+          <w:rFonts w:ascii="Arial Narrow" w:hAnsi="Arial Narrow"/>
+        </w:rPr>
+      </w:pPr>
+    </w:p>
+    <w:p>
+      <w:pPr>
+        <w:rPr>
+          <w:rFonts w:ascii="Arial Narrow" w:hAnsi="Arial Narrow"/>
+        </w:rPr>
+      </w:pPr>
+    </w:p>
+    <w:p>
+      <w:pPr>
+        <w:rPr>
+          <w:rFonts w:ascii="Arial Narrow" w:hAnsi="Arial Narrow"/>
+        </w:rPr>
+      </w:pPr>
+    </w:p>
+    <w:p>
+      <w:pPr>
+        <w:rPr>
+          <w:rFonts w:ascii="Arial Narrow" w:hAnsi="Arial Narrow"/>
+        </w:rPr>
+      </w:pPr>
+      <w:bookmarkStart w:id="1015" w:name="AppendixA"/>
       <w:r>
         <w:rPr>
           <w:b/>
@@ -11119,6 +10586,7 @@
         <w:lastRenderedPageBreak/>
         <w:t>APPENDIX A</w:t>
       </w:r>
+      <w:bookmarkEnd w:id="1015"/>
     </w:p>
     <w:p>
       <w:pPr>

</xml_diff>